<commit_message>
docs: standardize report measurement precision
</commit_message>
<xml_diff>
--- a/docs/design/cc_ep_deliverable3_performance_api.docx
+++ b/docs/design/cc_ep_deliverable3_performance_api.docx
@@ -433,7 +433,7 @@
       <w:r>
         <w:drawing>
           <wp:inline distT="0" distB="0" distL="0" distR="0">
-            <wp:extent cx="5900000" cy="1562859"/>
+            <wp:extent cx="5900000" cy="1604460"/>
             <wp:effectExtent l="0" t="0" r="0" b="0"/>
             <wp:docPr id="1" name="图 1-1 UBCC 三项性能指标验收结果"/>
             <wp:cNvGraphicFramePr>
@@ -455,7 +455,7 @@
                   <pic:spPr>
                     <a:xfrm>
                       <a:off x="0" y="0"/>
-                      <a:ext cx="5900000" cy="1562859"/>
+                      <a:ext cx="5900000" cy="1604460"/>
                     </a:xfrm>
                     <a:prstGeom prst="rect">
                       <a:avLst/>
@@ -557,18 +557,18 @@
               <w:rPr>
                 <w:rFonts w:ascii="Arial" w:hAnsi="Arial" w:eastAsia="等线"/>
               </w:rPr>
-              <w:t xml:space="preserve">≥ 1.5×</w:t>
-            </w:r>
-          </w:p>
-        </w:tc>
-        <w:tc>
-          <w:tcPr/>
-          <w:p>
-            <w:r>
-              <w:rPr>
-                <w:rFonts w:ascii="Arial" w:hAnsi="Arial" w:eastAsia="等线"/>
-              </w:rPr>
-              <w:t xml:space="preserve">1.515091×</w:t>
+              <w:t xml:space="preserve">≥ 1.500×</w:t>
+            </w:r>
+          </w:p>
+        </w:tc>
+        <w:tc>
+          <w:tcPr/>
+          <w:p>
+            <w:r>
+              <w:rPr>
+                <w:rFonts w:ascii="Arial" w:hAnsi="Arial" w:eastAsia="等线"/>
+              </w:rPr>
+              <w:t xml:space="preserve">1.515×</w:t>
             </w:r>
           </w:p>
         </w:tc>
@@ -606,18 +606,18 @@
               <w:rPr>
                 <w:rFonts w:ascii="Arial" w:hAnsi="Arial" w:eastAsia="等线"/>
               </w:rPr>
-              <w:t xml:space="preserve">&lt; 50 cycles</w:t>
-            </w:r>
-          </w:p>
-        </w:tc>
-        <w:tc>
-          <w:tcPr/>
-          <w:p>
-            <w:r>
-              <w:rPr>
-                <w:rFonts w:ascii="Arial" w:hAnsi="Arial" w:eastAsia="等线"/>
-              </w:rPr>
-              <w:t xml:space="preserve">-1635.994219 cycles</w:t>
+              <w:t xml:space="preserve">&lt; 50.000 cycles</w:t>
+            </w:r>
+          </w:p>
+        </w:tc>
+        <w:tc>
+          <w:tcPr/>
+          <w:p>
+            <w:r>
+              <w:rPr>
+                <w:rFonts w:ascii="Arial" w:hAnsi="Arial" w:eastAsia="等线"/>
+              </w:rPr>
+              <w:t xml:space="preserve">-1635.994 cycles</w:t>
             </w:r>
           </w:p>
         </w:tc>
@@ -655,18 +655,18 @@
               <w:rPr>
                 <w:rFonts w:ascii="Arial" w:hAnsi="Arial" w:eastAsia="等线"/>
               </w:rPr>
-              <w:t xml:space="preserve">≥ 10%</w:t>
-            </w:r>
-          </w:p>
-        </w:tc>
-        <w:tc>
-          <w:tcPr/>
-          <w:p>
-            <w:r>
-              <w:rPr>
-                <w:rFonts w:ascii="Arial" w:hAnsi="Arial" w:eastAsia="等线"/>
-              </w:rPr>
-              <w:t xml:space="preserve">64.759276%</w:t>
+              <w:t xml:space="preserve">≥ 10.000%</w:t>
+            </w:r>
+          </w:p>
+        </w:tc>
+        <w:tc>
+          <w:tcPr/>
+          <w:p>
+            <w:r>
+              <w:rPr>
+                <w:rFonts w:ascii="Arial" w:hAnsi="Arial" w:eastAsia="等线"/>
+              </w:rPr>
+              <w:t xml:space="preserve">64.759%</w:t>
             </w:r>
           </w:p>
         </w:tc>
@@ -2331,7 +2331,7 @@
               <w:rPr>
                 <w:rFonts w:ascii="Arial" w:hAnsi="Arial" w:eastAsia="等线"/>
               </w:rPr>
-              <w:t xml:space="preserve">1.515091×</w:t>
+              <w:t xml:space="preserve">1.515×</w:t>
             </w:r>
           </w:p>
         </w:tc>
@@ -2358,29 +2358,29 @@
               <w:rPr>
                 <w:rFonts w:ascii="Arial" w:hAnsi="Arial" w:eastAsia="等线"/>
               </w:rPr>
-              <w:t xml:space="preserve">899.031875 ns/op</w:t>
-            </w:r>
-          </w:p>
-        </w:tc>
-        <w:tc>
-          <w:tcPr/>
-          <w:p>
-            <w:r>
-              <w:rPr>
-                <w:rFonts w:ascii="Arial" w:hAnsi="Arial" w:eastAsia="等线"/>
-              </w:rPr>
-              <w:t xml:space="preserve">81.034765 ns/op</w:t>
-            </w:r>
-          </w:p>
-        </w:tc>
-        <w:tc>
-          <w:tcPr/>
-          <w:p>
-            <w:r>
-              <w:rPr>
-                <w:rFonts w:ascii="Arial" w:hAnsi="Arial" w:eastAsia="等线"/>
-              </w:rPr>
-              <w:t xml:space="preserve">-817.997109 ns/op</w:t>
+              <w:t xml:space="preserve">899.032 ns/op</w:t>
+            </w:r>
+          </w:p>
+        </w:tc>
+        <w:tc>
+          <w:tcPr/>
+          <w:p>
+            <w:r>
+              <w:rPr>
+                <w:rFonts w:ascii="Arial" w:hAnsi="Arial" w:eastAsia="等线"/>
+              </w:rPr>
+              <w:t xml:space="preserve">81.035 ns/op</w:t>
+            </w:r>
+          </w:p>
+        </w:tc>
+        <w:tc>
+          <w:tcPr/>
+          <w:p>
+            <w:r>
+              <w:rPr>
+                <w:rFonts w:ascii="Arial" w:hAnsi="Arial" w:eastAsia="等线"/>
+              </w:rPr>
+              <w:t xml:space="preserve">-817.997 ns/op</w:t>
             </w:r>
           </w:p>
         </w:tc>
@@ -2429,7 +2429,7 @@
               <w:rPr>
                 <w:rFonts w:ascii="Arial" w:hAnsi="Arial" w:eastAsia="等线"/>
               </w:rPr>
-              <w:t xml:space="preserve">-1635.994219 cycles</w:t>
+              <w:t xml:space="preserve">-1635.994 cycles</w:t>
             </w:r>
           </w:p>
         </w:tc>
@@ -2473,7 +2473,7 @@
         <w:rPr>
           <w:rFonts w:ascii="Arial" w:hAnsi="Arial" w:eastAsia="等线"/>
         </w:rPr>
-        <w:t xml:space="preserve">spill-noopt 的等效追踪容量达到 naive 的 1.515091 倍，超过 1.5 倍门槛。容量扩展由</w:t>
+        <w:t xml:space="preserve">spill-noopt 的等效追踪容量达到 naive 的 1.515 倍，超过 1.5 倍门槛。容量扩展由</w:t>
       </w:r>
     </w:p>
     <w:p>
@@ -2515,7 +2515,7 @@
         <w:rPr>
           <w:rFonts w:ascii="Arial" w:hAnsi="Arial" w:eastAsia="等线"/>
         </w:rPr>
-        <w:t xml:space="preserve">压力后的 guest 平均时延没有增加，spill-noopt 比 naive 低 817.997109 ns/op。该结果说明</w:t>
+        <w:t xml:space="preserve">压力后的 guest 平均时延没有增加，spill-noopt 比 naive 低 817.997 ns/op。该结果说明</w:t>
       </w:r>
     </w:p>
     <w:p>
@@ -2587,7 +2587,7 @@
         <w:rPr>
           <w:rFonts w:ascii="Arial" w:hAnsi="Arial" w:eastAsia="等线"/>
         </w:rPr>
-        <w:t xml:space="preserve">• 等效追踪容量提升 51.509094%；</w:t>
+        <w:t xml:space="preserve">• 等效追踪容量提升 51.509%；</w:t>
       </w:r>
     </w:p>
     <w:p>
@@ -3296,29 +3296,29 @@
               <w:rPr>
                 <w:rFonts w:ascii="Arial" w:hAnsi="Arial" w:eastAsia="等线"/>
               </w:rPr>
-              <w:t xml:space="preserve">2344.449361</w:t>
-            </w:r>
-          </w:p>
-        </w:tc>
-        <w:tc>
-          <w:tcPr/>
-          <w:p>
-            <w:r>
-              <w:rPr>
-                <w:rFonts w:ascii="Arial" w:hAnsi="Arial" w:eastAsia="等线"/>
-              </w:rPr>
-              <w:t xml:space="preserve">39.736430</w:t>
-            </w:r>
-          </w:p>
-        </w:tc>
-        <w:tc>
-          <w:tcPr/>
-          <w:p>
-            <w:r>
-              <w:rPr>
-                <w:rFonts w:ascii="Arial" w:hAnsi="Arial" w:eastAsia="等线"/>
-              </w:rPr>
-              <w:t xml:space="preserve">98.305085%</w:t>
+              <w:t xml:space="preserve">2344.449</w:t>
+            </w:r>
+          </w:p>
+        </w:tc>
+        <w:tc>
+          <w:tcPr/>
+          <w:p>
+            <w:r>
+              <w:rPr>
+                <w:rFonts w:ascii="Arial" w:hAnsi="Arial" w:eastAsia="等线"/>
+              </w:rPr>
+              <w:t xml:space="preserve">39.736</w:t>
+            </w:r>
+          </w:p>
+        </w:tc>
+        <w:tc>
+          <w:tcPr/>
+          <w:p>
+            <w:r>
+              <w:rPr>
+                <w:rFonts w:ascii="Arial" w:hAnsi="Arial" w:eastAsia="等线"/>
+              </w:rPr>
+              <w:t xml:space="preserve">98.305%</w:t>
             </w:r>
           </w:p>
         </w:tc>
@@ -3345,29 +3345,29 @@
               <w:rPr>
                 <w:rFonts w:ascii="Arial" w:hAnsi="Arial" w:eastAsia="等线"/>
               </w:rPr>
-              <w:t xml:space="preserve">2384.185791</w:t>
-            </w:r>
-          </w:p>
-        </w:tc>
-        <w:tc>
-          <w:tcPr/>
-          <w:p>
-            <w:r>
-              <w:rPr>
-                <w:rFonts w:ascii="Arial" w:hAnsi="Arial" w:eastAsia="等线"/>
-              </w:rPr>
-              <w:t xml:space="preserve">79.472860</w:t>
-            </w:r>
-          </w:p>
-        </w:tc>
-        <w:tc>
-          <w:tcPr/>
-          <w:p>
-            <w:r>
-              <w:rPr>
-                <w:rFonts w:ascii="Arial" w:hAnsi="Arial" w:eastAsia="等线"/>
-              </w:rPr>
-              <w:t xml:space="preserve">96.666667%</w:t>
+              <w:t xml:space="preserve">2384.186</w:t>
+            </w:r>
+          </w:p>
+        </w:tc>
+        <w:tc>
+          <w:tcPr/>
+          <w:p>
+            <w:r>
+              <w:rPr>
+                <w:rFonts w:ascii="Arial" w:hAnsi="Arial" w:eastAsia="等线"/>
+              </w:rPr>
+              <w:t xml:space="preserve">79.473</w:t>
+            </w:r>
+          </w:p>
+        </w:tc>
+        <w:tc>
+          <w:tcPr/>
+          <w:p>
+            <w:r>
+              <w:rPr>
+                <w:rFonts w:ascii="Arial" w:hAnsi="Arial" w:eastAsia="等线"/>
+              </w:rPr>
+              <w:t xml:space="preserve">96.667%</w:t>
             </w:r>
           </w:p>
         </w:tc>
@@ -3394,29 +3394,29 @@
               <w:rPr>
                 <w:rFonts w:ascii="Arial" w:hAnsi="Arial" w:eastAsia="等线"/>
               </w:rPr>
-              <w:t xml:space="preserve">2384.185791</w:t>
-            </w:r>
-          </w:p>
-        </w:tc>
-        <w:tc>
-          <w:tcPr/>
-          <w:p>
-            <w:r>
-              <w:rPr>
-                <w:rFonts w:ascii="Arial" w:hAnsi="Arial" w:eastAsia="等线"/>
-              </w:rPr>
-              <w:t xml:space="preserve">1788.139343</w:t>
-            </w:r>
-          </w:p>
-        </w:tc>
-        <w:tc>
-          <w:tcPr/>
-          <w:p>
-            <w:r>
-              <w:rPr>
-                <w:rFonts w:ascii="Arial" w:hAnsi="Arial" w:eastAsia="等线"/>
-              </w:rPr>
-              <w:t xml:space="preserve">25.000000%</w:t>
+              <w:t xml:space="preserve">2384.186</w:t>
+            </w:r>
+          </w:p>
+        </w:tc>
+        <w:tc>
+          <w:tcPr/>
+          <w:p>
+            <w:r>
+              <w:rPr>
+                <w:rFonts w:ascii="Arial" w:hAnsi="Arial" w:eastAsia="等线"/>
+              </w:rPr>
+              <w:t xml:space="preserve">1788.139</w:t>
+            </w:r>
+          </w:p>
+        </w:tc>
+        <w:tc>
+          <w:tcPr/>
+          <w:p>
+            <w:r>
+              <w:rPr>
+                <w:rFonts w:ascii="Arial" w:hAnsi="Arial" w:eastAsia="等线"/>
+              </w:rPr>
+              <w:t xml:space="preserve">25.000%</w:t>
             </w:r>
           </w:p>
         </w:tc>
@@ -3443,29 +3443,29 @@
               <w:rPr>
                 <w:rFonts w:ascii="Arial" w:hAnsi="Arial" w:eastAsia="等线"/>
               </w:rPr>
-              <w:t xml:space="preserve">2384.185791</w:t>
-            </w:r>
-          </w:p>
-        </w:tc>
-        <w:tc>
-          <w:tcPr/>
-          <w:p>
-            <w:r>
-              <w:rPr>
-                <w:rFonts w:ascii="Arial" w:hAnsi="Arial" w:eastAsia="等线"/>
-              </w:rPr>
-              <w:t xml:space="preserve">2702.077230</w:t>
-            </w:r>
-          </w:p>
-        </w:tc>
-        <w:tc>
-          <w:tcPr/>
-          <w:p>
-            <w:r>
-              <w:rPr>
-                <w:rFonts w:ascii="Arial" w:hAnsi="Arial" w:eastAsia="等线"/>
-              </w:rPr>
-              <w:t xml:space="preserve">-13.333333%</w:t>
+              <w:t xml:space="preserve">2384.186</w:t>
+            </w:r>
+          </w:p>
+        </w:tc>
+        <w:tc>
+          <w:tcPr/>
+          <w:p>
+            <w:r>
+              <w:rPr>
+                <w:rFonts w:ascii="Arial" w:hAnsi="Arial" w:eastAsia="等线"/>
+              </w:rPr>
+              <w:t xml:space="preserve">2702.077</w:t>
+            </w:r>
+          </w:p>
+        </w:tc>
+        <w:tc>
+          <w:tcPr/>
+          <w:p>
+            <w:r>
+              <w:rPr>
+                <w:rFonts w:ascii="Arial" w:hAnsi="Arial" w:eastAsia="等线"/>
+              </w:rPr>
+              <w:t xml:space="preserve">-13.333%</w:t>
             </w:r>
           </w:p>
         </w:tc>
@@ -3492,29 +3492,29 @@
               <w:rPr>
                 <w:rFonts w:ascii="Arial" w:hAnsi="Arial" w:eastAsia="等线"/>
               </w:rPr>
-              <w:t xml:space="preserve">23563.702901</w:t>
-            </w:r>
-          </w:p>
-        </w:tc>
-        <w:tc>
-          <w:tcPr/>
-          <w:p>
-            <w:r>
-              <w:rPr>
-                <w:rFonts w:ascii="Arial" w:hAnsi="Arial" w:eastAsia="等线"/>
-              </w:rPr>
-              <w:t xml:space="preserve">635.782878</w:t>
-            </w:r>
-          </w:p>
-        </w:tc>
-        <w:tc>
-          <w:tcPr/>
-          <w:p>
-            <w:r>
-              <w:rPr>
-                <w:rFonts w:ascii="Arial" w:hAnsi="Arial" w:eastAsia="等线"/>
-              </w:rPr>
-              <w:t xml:space="preserve">97.301855%</w:t>
+              <w:t xml:space="preserve">23563.703</w:t>
+            </w:r>
+          </w:p>
+        </w:tc>
+        <w:tc>
+          <w:tcPr/>
+          <w:p>
+            <w:r>
+              <w:rPr>
+                <w:rFonts w:ascii="Arial" w:hAnsi="Arial" w:eastAsia="等线"/>
+              </w:rPr>
+              <w:t xml:space="preserve">635.783</w:t>
+            </w:r>
+          </w:p>
+        </w:tc>
+        <w:tc>
+          <w:tcPr/>
+          <w:p>
+            <w:r>
+              <w:rPr>
+                <w:rFonts w:ascii="Arial" w:hAnsi="Arial" w:eastAsia="等线"/>
+              </w:rPr>
+              <w:t xml:space="preserve">97.302%</w:t>
             </w:r>
           </w:p>
         </w:tc>
@@ -3541,29 +3541,29 @@
               <w:rPr>
                 <w:rFonts w:ascii="Arial" w:hAnsi="Arial" w:eastAsia="等线"/>
               </w:rPr>
-              <w:t xml:space="preserve">4132.588704</w:t>
-            </w:r>
-          </w:p>
-        </w:tc>
-        <w:tc>
-          <w:tcPr/>
-          <w:p>
-            <w:r>
-              <w:rPr>
-                <w:rFonts w:ascii="Arial" w:hAnsi="Arial" w:eastAsia="等线"/>
-              </w:rPr>
-              <w:t xml:space="preserve">635.782878</w:t>
-            </w:r>
-          </w:p>
-        </w:tc>
-        <w:tc>
-          <w:tcPr/>
-          <w:p>
-            <w:r>
-              <w:rPr>
-                <w:rFonts w:ascii="Arial" w:hAnsi="Arial" w:eastAsia="等线"/>
-              </w:rPr>
-              <w:t xml:space="preserve">84.615385%</w:t>
+              <w:t xml:space="preserve">4132.589</w:t>
+            </w:r>
+          </w:p>
+        </w:tc>
+        <w:tc>
+          <w:tcPr/>
+          <w:p>
+            <w:r>
+              <w:rPr>
+                <w:rFonts w:ascii="Arial" w:hAnsi="Arial" w:eastAsia="等线"/>
+              </w:rPr>
+              <w:t xml:space="preserve">635.783</w:t>
+            </w:r>
+          </w:p>
+        </w:tc>
+        <w:tc>
+          <w:tcPr/>
+          <w:p>
+            <w:r>
+              <w:rPr>
+                <w:rFonts w:ascii="Arial" w:hAnsi="Arial" w:eastAsia="等线"/>
+              </w:rPr>
+              <w:t xml:space="preserve">84.615%</w:t>
             </w:r>
           </w:p>
         </w:tc>
@@ -3586,7 +3586,7 @@
         <w:rPr>
           <w:rFonts w:ascii="Arial" w:hAnsi="Arial" w:eastAsia="等线"/>
         </w:rPr>
-        <w:t xml:space="preserve">TC140 的 naive 均值为 119.209290 ns，低于 500 ns 适用门槛，因此作为低时延中性控制项，</w:t>
+        <w:t xml:space="preserve">TC140 的 naive 均值为 119.209 ns，低于 500 ns 适用门槛，因此作为低时延中性控制项，</w:t>
       </w:r>
     </w:p>
     <w:p>
@@ -3658,7 +3658,7 @@
         <w:rPr>
           <w:rFonts w:ascii="Consolas" w:hAnsi="Consolas" w:eastAsia="等线"/>
         </w:rPr>
-        <w:t xml:space="preserve">64.759276%</w:t>
+        <w:t xml:space="preserve">64.759%</w:t>
       </w:r>
     </w:p>
     <w:p>
@@ -3846,7 +3846,7 @@
         <w:rPr>
           <w:rFonts w:ascii="Arial" w:hAnsi="Arial" w:eastAsia="等线"/>
         </w:rPr>
-        <w:t xml:space="preserve">指标 2 的适用场景等权平均降幅为 64.759276%，超过 10% 合同门槛。</w:t>
+        <w:t xml:space="preserve">指标 2 的适用场景等权平均降幅为 64.759%，超过 10% 合同门槛。</w:t>
       </w:r>
     </w:p>
     <w:p>
@@ -4331,29 +4331,29 @@
               <w:rPr>
                 <w:rFonts w:ascii="Arial" w:hAnsi="Arial" w:eastAsia="等线"/>
               </w:rPr>
-              <w:t xml:space="preserve">5200.313656</w:t>
-            </w:r>
-          </w:p>
-        </w:tc>
-        <w:tc>
-          <w:tcPr/>
-          <w:p>
-            <w:r>
-              <w:rPr>
-                <w:rFonts w:ascii="Arial" w:hAnsi="Arial" w:eastAsia="等线"/>
-              </w:rPr>
-              <w:t xml:space="preserve">4437.245176</w:t>
-            </w:r>
-          </w:p>
-        </w:tc>
-        <w:tc>
-          <w:tcPr/>
-          <w:p>
-            <w:r>
-              <w:rPr>
-                <w:rFonts w:ascii="Arial" w:hAnsi="Arial" w:eastAsia="等线"/>
-              </w:rPr>
-              <w:t xml:space="preserve">14.673509%</w:t>
+              <w:t xml:space="preserve">5200.314</w:t>
+            </w:r>
+          </w:p>
+        </w:tc>
+        <w:tc>
+          <w:tcPr/>
+          <w:p>
+            <w:r>
+              <w:rPr>
+                <w:rFonts w:ascii="Arial" w:hAnsi="Arial" w:eastAsia="等线"/>
+              </w:rPr>
+              <w:t xml:space="preserve">4437.245</w:t>
+            </w:r>
+          </w:p>
+        </w:tc>
+        <w:tc>
+          <w:tcPr/>
+          <w:p>
+            <w:r>
+              <w:rPr>
+                <w:rFonts w:ascii="Arial" w:hAnsi="Arial" w:eastAsia="等线"/>
+              </w:rPr>
+              <w:t xml:space="preserve">14.674%</w:t>
             </w:r>
           </w:p>
         </w:tc>
@@ -4391,29 +4391,29 @@
               <w:rPr>
                 <w:rFonts w:ascii="Arial" w:hAnsi="Arial" w:eastAsia="等线"/>
               </w:rPr>
-              <w:t xml:space="preserve">3051.768241</w:t>
-            </w:r>
-          </w:p>
-        </w:tc>
-        <w:tc>
-          <w:tcPr/>
-          <w:p>
-            <w:r>
-              <w:rPr>
-                <w:rFonts w:ascii="Arial" w:hAnsi="Arial" w:eastAsia="等线"/>
-              </w:rPr>
-              <w:t xml:space="preserve">2267.770469</w:t>
-            </w:r>
-          </w:p>
-        </w:tc>
-        <w:tc>
-          <w:tcPr/>
-          <w:p>
-            <w:r>
-              <w:rPr>
-                <w:rFonts w:ascii="Arial" w:hAnsi="Arial" w:eastAsia="等线"/>
-              </w:rPr>
-              <w:t xml:space="preserve">25.689951%</w:t>
+              <w:t xml:space="preserve">3051.768</w:t>
+            </w:r>
+          </w:p>
+        </w:tc>
+        <w:tc>
+          <w:tcPr/>
+          <w:p>
+            <w:r>
+              <w:rPr>
+                <w:rFonts w:ascii="Arial" w:hAnsi="Arial" w:eastAsia="等线"/>
+              </w:rPr>
+              <w:t xml:space="preserve">2267.770</w:t>
+            </w:r>
+          </w:p>
+        </w:tc>
+        <w:tc>
+          <w:tcPr/>
+          <w:p>
+            <w:r>
+              <w:rPr>
+                <w:rFonts w:ascii="Arial" w:hAnsi="Arial" w:eastAsia="等线"/>
+              </w:rPr>
+              <w:t xml:space="preserve">25.690%</w:t>
             </w:r>
           </w:p>
         </w:tc>
@@ -4451,29 +4451,29 @@
               <w:rPr>
                 <w:rFonts w:ascii="Arial" w:hAnsi="Arial" w:eastAsia="等线"/>
               </w:rPr>
-              <w:t xml:space="preserve">5294.066796</w:t>
-            </w:r>
-          </w:p>
-        </w:tc>
-        <w:tc>
-          <w:tcPr/>
-          <w:p>
-            <w:r>
-              <w:rPr>
-                <w:rFonts w:ascii="Arial" w:hAnsi="Arial" w:eastAsia="等线"/>
-              </w:rPr>
-              <w:t xml:space="preserve">4400.848411</w:t>
-            </w:r>
-          </w:p>
-        </w:tc>
-        <w:tc>
-          <w:tcPr/>
-          <w:p>
-            <w:r>
-              <w:rPr>
-                <w:rFonts w:ascii="Arial" w:hAnsi="Arial" w:eastAsia="等线"/>
-              </w:rPr>
-              <w:t xml:space="preserve">16.872065%</w:t>
+              <w:t xml:space="preserve">5294.067</w:t>
+            </w:r>
+          </w:p>
+        </w:tc>
+        <w:tc>
+          <w:tcPr/>
+          <w:p>
+            <w:r>
+              <w:rPr>
+                <w:rFonts w:ascii="Arial" w:hAnsi="Arial" w:eastAsia="等线"/>
+              </w:rPr>
+              <w:t xml:space="preserve">4400.848</w:t>
+            </w:r>
+          </w:p>
+        </w:tc>
+        <w:tc>
+          <w:tcPr/>
+          <w:p>
+            <w:r>
+              <w:rPr>
+                <w:rFonts w:ascii="Arial" w:hAnsi="Arial" w:eastAsia="等线"/>
+              </w:rPr>
+              <w:t xml:space="preserve">16.872%</w:t>
             </w:r>
           </w:p>
         </w:tc>
@@ -4511,29 +4511,29 @@
               <w:rPr>
                 <w:rFonts w:ascii="Arial" w:hAnsi="Arial" w:eastAsia="等线"/>
               </w:rPr>
-              <w:t xml:space="preserve">2886.168659</w:t>
-            </w:r>
-          </w:p>
-        </w:tc>
-        <w:tc>
-          <w:tcPr/>
-          <w:p>
-            <w:r>
-              <w:rPr>
-                <w:rFonts w:ascii="Arial" w:hAnsi="Arial" w:eastAsia="等线"/>
-              </w:rPr>
-              <w:t xml:space="preserve">2291.965454</w:t>
-            </w:r>
-          </w:p>
-        </w:tc>
-        <w:tc>
-          <w:tcPr/>
-          <w:p>
-            <w:r>
-              <w:rPr>
-                <w:rFonts w:ascii="Arial" w:hAnsi="Arial" w:eastAsia="等线"/>
-              </w:rPr>
-              <w:t xml:space="preserve">20.587958%</w:t>
+              <w:t xml:space="preserve">2886.169</w:t>
+            </w:r>
+          </w:p>
+        </w:tc>
+        <w:tc>
+          <w:tcPr/>
+          <w:p>
+            <w:r>
+              <w:rPr>
+                <w:rFonts w:ascii="Arial" w:hAnsi="Arial" w:eastAsia="等线"/>
+              </w:rPr>
+              <w:t xml:space="preserve">2291.965</w:t>
+            </w:r>
+          </w:p>
+        </w:tc>
+        <w:tc>
+          <w:tcPr/>
+          <w:p>
+            <w:r>
+              <w:rPr>
+                <w:rFonts w:ascii="Arial" w:hAnsi="Arial" w:eastAsia="等线"/>
+              </w:rPr>
+              <w:t xml:space="preserve">20.588%</w:t>
             </w:r>
           </w:p>
         </w:tc>
@@ -4571,29 +4571,29 @@
               <w:rPr>
                 <w:rFonts w:ascii="Arial" w:hAnsi="Arial" w:eastAsia="等线"/>
               </w:rPr>
-              <w:t xml:space="preserve">3184.057277</w:t>
-            </w:r>
-          </w:p>
-        </w:tc>
-        <w:tc>
-          <w:tcPr/>
-          <w:p>
-            <w:r>
-              <w:rPr>
-                <w:rFonts w:ascii="Arial" w:hAnsi="Arial" w:eastAsia="等线"/>
-              </w:rPr>
-              <w:t xml:space="preserve">2266.780939</w:t>
-            </w:r>
-          </w:p>
-        </w:tc>
-        <w:tc>
-          <w:tcPr/>
-          <w:p>
-            <w:r>
-              <w:rPr>
-                <w:rFonts w:ascii="Arial" w:hAnsi="Arial" w:eastAsia="等线"/>
-              </w:rPr>
-              <w:t xml:space="preserve">28.808412%</w:t>
+              <w:t xml:space="preserve">3184.057</w:t>
+            </w:r>
+          </w:p>
+        </w:tc>
+        <w:tc>
+          <w:tcPr/>
+          <w:p>
+            <w:r>
+              <w:rPr>
+                <w:rFonts w:ascii="Arial" w:hAnsi="Arial" w:eastAsia="等线"/>
+              </w:rPr>
+              <w:t xml:space="preserve">2266.781</w:t>
+            </w:r>
+          </w:p>
+        </w:tc>
+        <w:tc>
+          <w:tcPr/>
+          <w:p>
+            <w:r>
+              <w:rPr>
+                <w:rFonts w:ascii="Arial" w:hAnsi="Arial" w:eastAsia="等线"/>
+              </w:rPr>
+              <w:t xml:space="preserve">28.808%</w:t>
             </w:r>
           </w:p>
         </w:tc>
@@ -4631,29 +4631,29 @@
               <w:rPr>
                 <w:rFonts w:ascii="Arial" w:hAnsi="Arial" w:eastAsia="等线"/>
               </w:rPr>
-              <w:t xml:space="preserve">2892.318056</w:t>
-            </w:r>
-          </w:p>
-        </w:tc>
-        <w:tc>
-          <w:tcPr/>
-          <w:p>
-            <w:r>
-              <w:rPr>
-                <w:rFonts w:ascii="Arial" w:hAnsi="Arial" w:eastAsia="等线"/>
-              </w:rPr>
-              <w:t xml:space="preserve">2321.670763</w:t>
-            </w:r>
-          </w:p>
-        </w:tc>
-        <w:tc>
-          <w:tcPr/>
-          <w:p>
-            <w:r>
-              <w:rPr>
-                <w:rFonts w:ascii="Arial" w:hAnsi="Arial" w:eastAsia="等线"/>
-              </w:rPr>
-              <w:t xml:space="preserve">19.729756%</w:t>
+              <w:t xml:space="preserve">2892.318</w:t>
+            </w:r>
+          </w:p>
+        </w:tc>
+        <w:tc>
+          <w:tcPr/>
+          <w:p>
+            <w:r>
+              <w:rPr>
+                <w:rFonts w:ascii="Arial" w:hAnsi="Arial" w:eastAsia="等线"/>
+              </w:rPr>
+              <w:t xml:space="preserve">2321.671</w:t>
+            </w:r>
+          </w:p>
+        </w:tc>
+        <w:tc>
+          <w:tcPr/>
+          <w:p>
+            <w:r>
+              <w:rPr>
+                <w:rFonts w:ascii="Arial" w:hAnsi="Arial" w:eastAsia="等线"/>
+              </w:rPr>
+              <w:t xml:space="preserve">19.730%</w:t>
             </w:r>
           </w:p>
         </w:tc>
@@ -5012,58 +5012,6 @@
         <w:t xml:space="preserve"/>
       </w:r>
     </w:p>
-    <w:p>
-      <w:pPr>
-        <w:jc w:val="center"/>
-        <w:spacing w:before="120" w:after="120"/>
-      </w:pPr>
-      <w:r>
-        <w:drawing>
-          <wp:inline distT="0" distB="0" distL="0" distR="0">
-            <wp:extent cx="5900000" cy="3037569"/>
-            <wp:effectExtent l="0" t="0" r="0" b="0"/>
-            <wp:docPr id="1" name="图 5-1 UBCC 与 HA-VI 聚合时延对比"/>
-            <wp:cNvGraphicFramePr>
-              <a:graphicFrameLocks xmlns:a="http://schemas.openxmlformats.org/drawingml/2006/main" noChangeAspect="1"/>
-            </wp:cNvGraphicFramePr>
-            <a:graphic xmlns:a="http://schemas.openxmlformats.org/drawingml/2006/main">
-              <a:graphicData uri="http://schemas.openxmlformats.org/drawingml/2006/picture">
-                <pic:pic xmlns:pic="http://schemas.openxmlformats.org/drawingml/2006/picture">
-                  <pic:nvPicPr>
-                    <pic:cNvPr id="0" name="图 5-1 UBCC 与 HA-VI 聚合时延对比"/>
-                    <pic:cNvPicPr/>
-                  </pic:nvPicPr>
-                  <pic:blipFill>
-                    <a:blip xmlns:r="http://schemas.openxmlformats.org/officeDocument/2006/relationships" r:embed="rIdImage2"/>
-                    <a:stretch>
-                      <a:fillRect/>
-                    </a:stretch>
-                  </pic:blipFill>
-                  <pic:spPr>
-                    <a:xfrm>
-                      <a:off x="0" y="0"/>
-                      <a:ext cx="5900000" cy="3037569"/>
-                    </a:xfrm>
-                    <a:prstGeom prst="rect">
-                      <a:avLst/>
-                    </a:prstGeom>
-                  </pic:spPr>
-                </pic:pic>
-              </a:graphicData>
-            </a:graphic>
-          </wp:inline>
-        </w:drawing>
-      </w:r>
-    </w:p>
-    <w:p>
-      <w:pPr/>
-      <w:r>
-        <w:rPr>
-          <w:rFonts w:ascii="Arial" w:hAnsi="Arial" w:eastAsia="等线"/>
-        </w:rPr>
-        <w:t xml:space="preserve"/>
-      </w:r>
-    </w:p>
     <w:tbl>
       <w:tblPr>
         <w:tblStyle w:val="TableGrid"/>
@@ -5167,29 +5115,29 @@
               <w:rPr>
                 <w:rFonts w:ascii="Arial" w:hAnsi="Arial" w:eastAsia="等线"/>
               </w:rPr>
-              <w:t xml:space="preserve">31.439583</w:t>
-            </w:r>
-          </w:p>
-        </w:tc>
-        <w:tc>
-          <w:tcPr/>
-          <w:p>
-            <w:r>
-              <w:rPr>
-                <w:rFonts w:ascii="Arial" w:hAnsi="Arial" w:eastAsia="等线"/>
-              </w:rPr>
-              <w:t xml:space="preserve">39.343750</w:t>
-            </w:r>
-          </w:p>
-        </w:tc>
-        <w:tc>
-          <w:tcPr/>
-          <w:p>
-            <w:r>
-              <w:rPr>
-                <w:rFonts w:ascii="Arial" w:hAnsi="Arial" w:eastAsia="等线"/>
-              </w:rPr>
-              <w:t xml:space="preserve">20.090019%</w:t>
+              <w:t xml:space="preserve">31.440</w:t>
+            </w:r>
+          </w:p>
+        </w:tc>
+        <w:tc>
+          <w:tcPr/>
+          <w:p>
+            <w:r>
+              <w:rPr>
+                <w:rFonts w:ascii="Arial" w:hAnsi="Arial" w:eastAsia="等线"/>
+              </w:rPr>
+              <w:t xml:space="preserve">39.344</w:t>
+            </w:r>
+          </w:p>
+        </w:tc>
+        <w:tc>
+          <w:tcPr/>
+          <w:p>
+            <w:r>
+              <w:rPr>
+                <w:rFonts w:ascii="Arial" w:hAnsi="Arial" w:eastAsia="等线"/>
+              </w:rPr>
+              <w:t xml:space="preserve">20.090%</w:t>
             </w:r>
           </w:p>
         </w:tc>
@@ -5227,29 +5175,29 @@
               <w:rPr>
                 <w:rFonts w:ascii="Arial" w:hAnsi="Arial" w:eastAsia="等线"/>
               </w:rPr>
-              <w:t xml:space="preserve">76.177500</w:t>
-            </w:r>
-          </w:p>
-        </w:tc>
-        <w:tc>
-          <w:tcPr/>
-          <w:p>
-            <w:r>
-              <w:rPr>
-                <w:rFonts w:ascii="Arial" w:hAnsi="Arial" w:eastAsia="等线"/>
-              </w:rPr>
-              <w:t xml:space="preserve">79.059583</w:t>
-            </w:r>
-          </w:p>
-        </w:tc>
-        <w:tc>
-          <w:tcPr/>
-          <w:p>
-            <w:r>
-              <w:rPr>
-                <w:rFonts w:ascii="Arial" w:hAnsi="Arial" w:eastAsia="等线"/>
-              </w:rPr>
-              <w:t xml:space="preserve">3.645457%</w:t>
+              <w:t xml:space="preserve">76.178</w:t>
+            </w:r>
+          </w:p>
+        </w:tc>
+        <w:tc>
+          <w:tcPr/>
+          <w:p>
+            <w:r>
+              <w:rPr>
+                <w:rFonts w:ascii="Arial" w:hAnsi="Arial" w:eastAsia="等线"/>
+              </w:rPr>
+              <w:t xml:space="preserve">79.060</w:t>
+            </w:r>
+          </w:p>
+        </w:tc>
+        <w:tc>
+          <w:tcPr/>
+          <w:p>
+            <w:r>
+              <w:rPr>
+                <w:rFonts w:ascii="Arial" w:hAnsi="Arial" w:eastAsia="等线"/>
+              </w:rPr>
+              <w:t xml:space="preserve">3.645%</w:t>
             </w:r>
           </w:p>
         </w:tc>
@@ -5287,29 +5235,29 @@
               <w:rPr>
                 <w:rFonts w:ascii="Arial" w:hAnsi="Arial" w:eastAsia="等线"/>
               </w:rPr>
-              <w:t xml:space="preserve">31.406250</w:t>
-            </w:r>
-          </w:p>
-        </w:tc>
-        <w:tc>
-          <w:tcPr/>
-          <w:p>
-            <w:r>
-              <w:rPr>
-                <w:rFonts w:ascii="Arial" w:hAnsi="Arial" w:eastAsia="等线"/>
-              </w:rPr>
-              <w:t xml:space="preserve">39.345833</w:t>
-            </w:r>
-          </w:p>
-        </w:tc>
-        <w:tc>
-          <w:tcPr/>
-          <w:p>
-            <w:r>
-              <w:rPr>
-                <w:rFonts w:ascii="Arial" w:hAnsi="Arial" w:eastAsia="等线"/>
-              </w:rPr>
-              <w:t xml:space="preserve">20.178969%</w:t>
+              <w:t xml:space="preserve">31.406</w:t>
+            </w:r>
+          </w:p>
+        </w:tc>
+        <w:tc>
+          <w:tcPr/>
+          <w:p>
+            <w:r>
+              <w:rPr>
+                <w:rFonts w:ascii="Arial" w:hAnsi="Arial" w:eastAsia="等线"/>
+              </w:rPr>
+              <w:t xml:space="preserve">39.346</w:t>
+            </w:r>
+          </w:p>
+        </w:tc>
+        <w:tc>
+          <w:tcPr/>
+          <w:p>
+            <w:r>
+              <w:rPr>
+                <w:rFonts w:ascii="Arial" w:hAnsi="Arial" w:eastAsia="等线"/>
+              </w:rPr>
+              <w:t xml:space="preserve">20.179%</w:t>
             </w:r>
           </w:p>
         </w:tc>
@@ -5347,29 +5295,29 @@
               <w:rPr>
                 <w:rFonts w:ascii="Arial" w:hAnsi="Arial" w:eastAsia="等线"/>
               </w:rPr>
-              <w:t xml:space="preserve">76.194622</w:t>
-            </w:r>
-          </w:p>
-        </w:tc>
-        <w:tc>
-          <w:tcPr/>
-          <w:p>
-            <w:r>
-              <w:rPr>
-                <w:rFonts w:ascii="Arial" w:hAnsi="Arial" w:eastAsia="等线"/>
-              </w:rPr>
-              <w:t xml:space="preserve">79.073138</w:t>
-            </w:r>
-          </w:p>
-        </w:tc>
-        <w:tc>
-          <w:tcPr/>
-          <w:p>
-            <w:r>
-              <w:rPr>
-                <w:rFonts w:ascii="Arial" w:hAnsi="Arial" w:eastAsia="等线"/>
-              </w:rPr>
-              <w:t xml:space="preserve">3.640320%</w:t>
+              <w:t xml:space="preserve">76.195</w:t>
+            </w:r>
+          </w:p>
+        </w:tc>
+        <w:tc>
+          <w:tcPr/>
+          <w:p>
+            <w:r>
+              <w:rPr>
+                <w:rFonts w:ascii="Arial" w:hAnsi="Arial" w:eastAsia="等线"/>
+              </w:rPr>
+              <w:t xml:space="preserve">79.073</w:t>
+            </w:r>
+          </w:p>
+        </w:tc>
+        <w:tc>
+          <w:tcPr/>
+          <w:p>
+            <w:r>
+              <w:rPr>
+                <w:rFonts w:ascii="Arial" w:hAnsi="Arial" w:eastAsia="等线"/>
+              </w:rPr>
+              <w:t xml:space="preserve">3.640%</w:t>
             </w:r>
           </w:p>
         </w:tc>
@@ -7729,7 +7677,7 @@
         <w:rPr>
           <w:rFonts w:ascii="Arial" w:hAnsi="Arial" w:eastAsia="等线"/>
         </w:rPr>
-        <w:t xml:space="preserve">实现 1.515091 倍等效追踪容量，optimized profile 在适用场景中取得 64.759276% 等权平均</w:t>
+        <w:t xml:space="preserve">实现 1.515 倍等效追踪容量，optimized profile 在适用场景中取得 64.759% 等权平均</w:t>
       </w:r>
     </w:p>
     <w:p>

</xml_diff>

<commit_message>
docs: publish audited recent performance charts and coverage
</commit_message>
<xml_diff>
--- a/docs/design/cc_ep_deliverable3_performance_api.docx
+++ b/docs/design/cc_ep_deliverable3_performance_api.docx
@@ -245,7 +245,18 @@
         <w:rPr>
           <w:rFonts w:ascii="Calibri" w:hAnsi="Calibri" w:eastAsia="Microsoft YaHei" w:cs="Calibri"/>
         </w:rPr>
-        <w:t xml:space="preserve">指标均达到正式⁠验⁠收⁠口⁠径⁠。</w:t>
+        <w:t xml:space="preserve">指标均达到历史正式验收口径。本节保留历史三轮合同数值；第 3.6、4.1–4.4、⁠4⁠.⁠6⁠ ⁠节</w:t>
+      </w:r>
+    </w:p>
+    <w:p>
+      <w:pPr>
+        <w:ind w:left="0" w:firstLine="420"/>
+      </w:pPr>
+      <w:r>
+        <w:rPr>
+          <w:rFonts w:ascii="Calibri" w:hAnsi="Calibri" w:eastAsia="Microsoft YaHei" w:cs="Calibri"/>
+        </w:rPr>
+        <w:t xml:space="preserve">另行发布 2026-09-06–08 批次的扩展实测，不将单轮新值称为三轮验收，不重写⁠历⁠史⁠结⁠论⁠。</w:t>
       </w:r>
     </w:p>
     <w:tbl>
@@ -6073,7 +6084,7 @@
       <w:r>
         <w:drawing>
           <wp:inline distT="0" distB="0" distL="0" distR="0">
-            <wp:extent cx="3600000" cy="1545821"/>
+            <wp:extent cx="3600000" cy="1475273"/>
             <wp:effectExtent l="0" t="0" r="0" b="0"/>
             <wp:docPr id="1" name="图 3-1 指标 1 容量与 Outer 附加时延" descr="图 3-1 指标 1 容量与 Outer 附加时延"/>
             <wp:cNvGraphicFramePr>
@@ -6095,7 +6106,7 @@
                   <pic:spPr>
                     <a:xfrm>
                       <a:off x="0" y="0"/>
-                      <a:ext cx="3600000" cy="1545821"/>
+                      <a:ext cx="3600000" cy="1475273"/>
                     </a:xfrm>
                     <a:prstGeom prst="rect">
                       <a:avLst/>
@@ -8770,7 +8781,7 @@
         <w:rPr>
           <w:rFonts w:ascii="Calibri" w:hAnsi="Calibri" w:eastAsia="Microsoft YaHei" w:cs="Calibri"/>
         </w:rPr>
-        <w:t xml:space="preserve">8N1S、8N2S 和 16N1S 拓扑。图 3-3 对每个压力/拓扑坐标先计算六个代表应用的⁠均⁠值⁠；⁠容⁠量</w:t>
+        <w:t xml:space="preserve">8N1S、8N2S 和 16N1S 拓扑。2026-09-06–08 批次的 60 个坐标、180 个选定⁠臂⁠均⁠已⁠核⁠实</w:t>
       </w:r>
     </w:p>
     <w:p>
@@ -8781,7 +8792,7 @@
         <w:rPr>
           <w:rFonts w:ascii="Calibri" w:hAnsi="Calibri" w:eastAsia="Microsoft YaHei" w:cs="Calibri"/>
         </w:rPr>
-        <w:t xml:space="preserve">使用 spill 相对 naive 的等效追踪容量增幅，时延使用 spill 相对超大 ResidentDir ⁠参⁠考⁠角⁠色⁠的</w:t>
+        <w:t xml:space="preserve">PASS 源文件。P175/P200 是目录目标压力，不是 L3 压力。替换批只替换指定臂；P175/8N2S/</w:t>
       </w:r>
     </w:p>
     <w:p>
@@ -8792,7 +8803,7 @@
         <w:rPr>
           <w:rFonts w:ascii="Calibri" w:hAnsi="Calibri" w:eastAsia="Microsoft YaHei" w:cs="Calibri"/>
         </w:rPr>
-        <w:t xml:space="preserve">已完成 Outer 均值差。该扩展矩阵用于展示目录压力和节点规模下的⁠变⁠化⁠趋⁠势⁠。</w:t>
+        <w:t xml:space="preserve">TC143/naive 采用 9 月 7 日完整通过的本地隔离重跑，不重复计入远端旧失败臂或⁠后⁠续⁠重⁠跑⁠。</w:t>
       </w:r>
     </w:p>
     <w:p>
@@ -8803,7 +8814,7 @@
         <w:rPr>
           <w:rFonts w:ascii="Calibri" w:hAnsi="Calibri" w:eastAsia="Microsoft YaHei" w:cs="Calibri"/>
         </w:rPr>
-        <w:t xml:space="preserve">175% 压力下五个拓扑的平均容量增幅为 58.7%-86.7%；200% 压力下⁠五⁠个⁠拓⁠扑⁠的</w:t>
+        <w:t xml:space="preserve">容量柱为 max(spill ResidentDir capacity, Home0/socket0 H64 exact live) / naive capacity，</w:t>
       </w:r>
     </w:p>
     <w:p>
@@ -8814,7 +8825,7 @@
         <w:rPr>
           <w:rFonts w:ascii="Calibri" w:hAnsi="Calibri" w:eastAsia="Microsoft YaHei" w:cs="Calibri"/>
         </w:rPr>
-        <w:t xml:space="preserve">平均容量增幅为 86.9%-120.5%。</w:t>
+        <w:t xml:space="preserve">不把 resident 与 H64 重复相加。每个 TC 内五拓扑取几何平均（GM），末柱为六个 TC ⁠的⁠ ⁠G⁠M⁠。</w:t>
       </w:r>
     </w:p>
     <w:p>
@@ -8825,7 +8836,7 @@
         <w:rPr>
           <w:rFonts w:ascii="Calibri" w:hAnsi="Calibri" w:eastAsia="Microsoft YaHei" w:cs="Calibri"/>
         </w:rPr>
-        <w:t xml:space="preserve">3N1S、3N2S 和 8N1S 的已完成平均 Outer 增⁠量⁠保⁠持⁠在⁠约</w:t>
+        <w:t xml:space="preserve">Delta 为每臂合并所有进程 completed Outer 事件后的均值差乘 2，单位 cycles @ 2 GHz；</w:t>
       </w:r>
     </w:p>
     <w:p>
@@ -8836,7 +8847,7 @@
         <w:rPr>
           <w:rFonts w:ascii="Calibri" w:hAnsi="Calibri" w:eastAsia="Microsoft YaHei" w:cs="Calibri"/>
         </w:rPr>
-        <w:t xml:space="preserve">24-28 cycles；16N1S 中的 B-tree、FaaS 和 feature-store 路径表现出更高的 spill/fill</w:t>
+        <w:t xml:space="preserve">每个 TC 内五拓扑取算术平均（AM），末柱为六个 TC AM 的 AM。汇总柱不⁠重⁠复⁠计⁠权⁠。</w:t>
       </w:r>
     </w:p>
     <w:p>
@@ -8847,7 +8858,7 @@
         <w:rPr>
           <w:rFonts w:ascii="Calibri" w:hAnsi="Calibri" w:eastAsia="Microsoft YaHei" w:cs="Calibri"/>
         </w:rPr>
-        <w:t xml:space="preserve">敏感性，说明高节点数和高元数据 churn 会将后备目录访问放大为⁠排⁠队⁠成⁠本⁠。</w:t>
+        <w:t xml:space="preserve">负 Delta 原样显示；参考线分别为 1.5× 以及 0、50 cycles。两个压力分面⁠独⁠立⁠汇⁠总⁠。</w:t>
       </w:r>
     </w:p>
     <w:tbl>
@@ -8863,10 +8874,10 @@
         </w:tblCellMar>
       </w:tblPr>
       <w:tblGrid>
-        <w:gridCol w:w="1473"/>
-        <w:gridCol w:w="1473"/>
-        <w:gridCol w:w="1885"/>
-        <w:gridCol w:w="4767"/>
+        <w:gridCol w:w="1490"/>
+        <w:gridCol w:w="2050"/>
+        <w:gridCol w:w="1630"/>
+        <w:gridCol w:w="4430"/>
       </w:tblGrid>
       <w:tr>
         <w:trPr>
@@ -8875,7 +8886,7 @@
         </w:trPr>
         <w:tc>
           <w:tcPr>
-            <w:tcW w:w="1473" w:type="dxa"/>
+            <w:tcW w:w="1490" w:type="dxa"/>
             <w:shd w:val="clear" w:color="auto" w:fill="D9E2F3"/>
           </w:tcPr>
           <w:p>
@@ -8892,13 +8903,13 @@
                 <w:sz w:val="18"/>
                 <w:szCs w:val="18"/>
               </w:rPr>
-              <w:t xml:space="preserve">目标压力</w:t>
-            </w:r>
-          </w:p>
-        </w:tc>
-        <w:tc>
-          <w:tcPr>
-            <w:tcW w:w="1473" w:type="dxa"/>
+              <w:t xml:space="preserve">目录目标压力</w:t>
+            </w:r>
+          </w:p>
+        </w:tc>
+        <w:tc>
+          <w:tcPr>
+            <w:tcW w:w="2050" w:type="dxa"/>
             <w:shd w:val="clear" w:color="auto" w:fill="D9E2F3"/>
           </w:tcPr>
           <w:p>
@@ -8915,13 +8926,13 @@
                 <w:sz w:val="18"/>
                 <w:szCs w:val="18"/>
               </w:rPr>
-              <w:t xml:space="preserve">拓扑</w:t>
-            </w:r>
-          </w:p>
-        </w:tc>
-        <w:tc>
-          <w:tcPr>
-            <w:tcW w:w="1885" w:type="dxa"/>
+              <w:t xml:space="preserve">实测坐标 / 选定臂</w:t>
+            </w:r>
+          </w:p>
+        </w:tc>
+        <w:tc>
+          <w:tcPr>
+            <w:tcW w:w="1630" w:type="dxa"/>
             <w:shd w:val="clear" w:color="auto" w:fill="D9E2F3"/>
           </w:tcPr>
           <w:p>
@@ -8938,13 +8949,13 @@
                 <w:sz w:val="18"/>
                 <w:szCs w:val="18"/>
               </w:rPr>
-              <w:t xml:space="preserve">六应用平均容量增幅</w:t>
-            </w:r>
-          </w:p>
-        </w:tc>
-        <w:tc>
-          <w:tcPr>
-            <w:tcW w:w="4767" w:type="dxa"/>
+              <w:t xml:space="preserve">容量层级 G⁠M</w:t>
+            </w:r>
+          </w:p>
+        </w:tc>
+        <w:tc>
+          <w:tcPr>
+            <w:tcW w:w="4430" w:type="dxa"/>
             <w:shd w:val="clear" w:color="auto" w:fill="D9E2F3"/>
           </w:tcPr>
           <w:p>
@@ -8961,7 +8972,7 @@
                 <w:sz w:val="18"/>
                 <w:szCs w:val="18"/>
               </w:rPr>
-              <w:t xml:space="preserve">六应用平均 O⁠u⁠t⁠e⁠r 增量（c⁠y⁠c⁠l⁠e⁠s @ 2 G⁠H⁠z）</w:t>
+              <w:t xml:space="preserve">D⁠e⁠l⁠t⁠a 层级 A⁠M（c⁠y⁠c⁠l⁠e⁠s @ 2 G⁠H⁠z）</w:t>
             </w:r>
           </w:p>
         </w:tc>
@@ -8972,7 +8983,7 @@
         </w:trPr>
         <w:tc>
           <w:tcPr>
-            <w:tcW w:w="1473" w:type="dxa"/>
+            <w:tcW w:w="1490" w:type="dxa"/>
           </w:tcPr>
           <w:p>
             <w:pPr>
@@ -8993,64 +9004,64 @@
         </w:tc>
         <w:tc>
           <w:tcPr>
-            <w:tcW w:w="1473" w:type="dxa"/>
-          </w:tcPr>
-          <w:p>
-            <w:pPr>
-              <w:pStyle w:val="TableText"/>
-              <w:jc w:val="left"/>
-              <w:wordWrap w:val="0"/>
-              <w:spacing w:before="0" w:after="0" w:line="320" w:lineRule="exact"/>
-            </w:pPr>
-            <w:r>
-              <w:rPr>
-                <w:rFonts w:ascii="Calibri" w:hAnsi="Calibri" w:eastAsia="Microsoft YaHei" w:cs="Calibri"/>
-                <w:sz w:val="18"/>
-                <w:szCs w:val="18"/>
-              </w:rPr>
-              <w:t xml:space="preserve">3N1S</w:t>
-            </w:r>
-          </w:p>
-        </w:tc>
-        <w:tc>
-          <w:tcPr>
-            <w:tcW w:w="1885" w:type="dxa"/>
-          </w:tcPr>
-          <w:p>
-            <w:pPr>
-              <w:pStyle w:val="TableText"/>
-              <w:jc w:val="left"/>
-              <w:wordWrap w:val="0"/>
-              <w:spacing w:before="0" w:after="0" w:line="320" w:lineRule="exact"/>
-            </w:pPr>
-            <w:r>
-              <w:rPr>
-                <w:rFonts w:ascii="Calibri" w:hAnsi="Calibri" w:eastAsia="Microsoft YaHei" w:cs="Calibri"/>
-                <w:sz w:val="18"/>
-                <w:szCs w:val="18"/>
-              </w:rPr>
-              <w:t xml:space="preserve">65.5%</w:t>
-            </w:r>
-          </w:p>
-        </w:tc>
-        <w:tc>
-          <w:tcPr>
-            <w:tcW w:w="4767" w:type="dxa"/>
-          </w:tcPr>
-          <w:p>
-            <w:pPr>
-              <w:pStyle w:val="TableText"/>
-              <w:jc w:val="left"/>
-              <w:wordWrap w:val="0"/>
-              <w:spacing w:before="0" w:after="0" w:line="320" w:lineRule="exact"/>
-            </w:pPr>
-            <w:r>
-              <w:rPr>
-                <w:rFonts w:ascii="Calibri" w:hAnsi="Calibri" w:eastAsia="Microsoft YaHei" w:cs="Calibri"/>
-                <w:sz w:val="18"/>
-                <w:szCs w:val="18"/>
-              </w:rPr>
-              <w:t xml:space="preserve">24.2</w:t>
+            <w:tcW w:w="2050" w:type="dxa"/>
+          </w:tcPr>
+          <w:p>
+            <w:pPr>
+              <w:pStyle w:val="TableText"/>
+              <w:jc w:val="left"/>
+              <w:wordWrap w:val="0"/>
+              <w:spacing w:before="0" w:after="0" w:line="320" w:lineRule="exact"/>
+            </w:pPr>
+            <w:r>
+              <w:rPr>
+                <w:rFonts w:ascii="Calibri" w:hAnsi="Calibri" w:eastAsia="Microsoft YaHei" w:cs="Calibri"/>
+                <w:sz w:val="18"/>
+                <w:szCs w:val="18"/>
+              </w:rPr>
+              <w:t xml:space="preserve">30 / 90</w:t>
+            </w:r>
+          </w:p>
+        </w:tc>
+        <w:tc>
+          <w:tcPr>
+            <w:tcW w:w="1630" w:type="dxa"/>
+          </w:tcPr>
+          <w:p>
+            <w:pPr>
+              <w:pStyle w:val="TableText"/>
+              <w:jc w:val="left"/>
+              <w:wordWrap w:val="0"/>
+              <w:spacing w:before="0" w:after="0" w:line="320" w:lineRule="exact"/>
+            </w:pPr>
+            <w:r>
+              <w:rPr>
+                <w:rFonts w:ascii="Calibri" w:hAnsi="Calibri" w:eastAsia="Microsoft YaHei" w:cs="Calibri"/>
+                <w:sz w:val="18"/>
+                <w:szCs w:val="18"/>
+              </w:rPr>
+              <w:t xml:space="preserve">1.660×</w:t>
+            </w:r>
+          </w:p>
+        </w:tc>
+        <w:tc>
+          <w:tcPr>
+            <w:tcW w:w="4430" w:type="dxa"/>
+          </w:tcPr>
+          <w:p>
+            <w:pPr>
+              <w:pStyle w:val="TableText"/>
+              <w:jc w:val="left"/>
+              <w:wordWrap w:val="0"/>
+              <w:spacing w:before="0" w:after="0" w:line="320" w:lineRule="exact"/>
+            </w:pPr>
+            <w:r>
+              <w:rPr>
+                <w:rFonts w:ascii="Calibri" w:hAnsi="Calibri" w:eastAsia="Microsoft YaHei" w:cs="Calibri"/>
+                <w:sz w:val="18"/>
+                <w:szCs w:val="18"/>
+              </w:rPr>
+              <w:t xml:space="preserve">24.200</w:t>
             </w:r>
           </w:p>
         </w:tc>
@@ -9061,363 +9072,7 @@
         </w:trPr>
         <w:tc>
           <w:tcPr>
-            <w:tcW w:w="1473" w:type="dxa"/>
-          </w:tcPr>
-          <w:p>
-            <w:pPr>
-              <w:pStyle w:val="TableText"/>
-              <w:jc w:val="left"/>
-              <w:wordWrap w:val="0"/>
-              <w:spacing w:before="0" w:after="0" w:line="320" w:lineRule="exact"/>
-            </w:pPr>
-            <w:r>
-              <w:rPr>
-                <w:rFonts w:ascii="Calibri" w:hAnsi="Calibri" w:eastAsia="Microsoft YaHei" w:cs="Calibri"/>
-                <w:sz w:val="18"/>
-                <w:szCs w:val="18"/>
-              </w:rPr>
-              <w:t xml:space="preserve">175%</w:t>
-            </w:r>
-          </w:p>
-        </w:tc>
-        <w:tc>
-          <w:tcPr>
-            <w:tcW w:w="1473" w:type="dxa"/>
-          </w:tcPr>
-          <w:p>
-            <w:pPr>
-              <w:pStyle w:val="TableText"/>
-              <w:jc w:val="left"/>
-              <w:wordWrap w:val="0"/>
-              <w:spacing w:before="0" w:after="0" w:line="320" w:lineRule="exact"/>
-            </w:pPr>
-            <w:r>
-              <w:rPr>
-                <w:rFonts w:ascii="Calibri" w:hAnsi="Calibri" w:eastAsia="Microsoft YaHei" w:cs="Calibri"/>
-                <w:sz w:val="18"/>
-                <w:szCs w:val="18"/>
-              </w:rPr>
-              <w:t xml:space="preserve">3N2S</w:t>
-            </w:r>
-          </w:p>
-        </w:tc>
-        <w:tc>
-          <w:tcPr>
-            <w:tcW w:w="1885" w:type="dxa"/>
-          </w:tcPr>
-          <w:p>
-            <w:pPr>
-              <w:pStyle w:val="TableText"/>
-              <w:jc w:val="left"/>
-              <w:wordWrap w:val="0"/>
-              <w:spacing w:before="0" w:after="0" w:line="320" w:lineRule="exact"/>
-            </w:pPr>
-            <w:r>
-              <w:rPr>
-                <w:rFonts w:ascii="Calibri" w:hAnsi="Calibri" w:eastAsia="Microsoft YaHei" w:cs="Calibri"/>
-                <w:sz w:val="18"/>
-                <w:szCs w:val="18"/>
-              </w:rPr>
-              <w:t xml:space="preserve">61.2%</w:t>
-            </w:r>
-          </w:p>
-        </w:tc>
-        <w:tc>
-          <w:tcPr>
-            <w:tcW w:w="4767" w:type="dxa"/>
-          </w:tcPr>
-          <w:p>
-            <w:pPr>
-              <w:pStyle w:val="TableText"/>
-              <w:jc w:val="left"/>
-              <w:wordWrap w:val="0"/>
-              <w:spacing w:before="0" w:after="0" w:line="320" w:lineRule="exact"/>
-            </w:pPr>
-            <w:r>
-              <w:rPr>
-                <w:rFonts w:ascii="Calibri" w:hAnsi="Calibri" w:eastAsia="Microsoft YaHei" w:cs="Calibri"/>
-                <w:sz w:val="18"/>
-                <w:szCs w:val="18"/>
-              </w:rPr>
-              <w:t xml:space="preserve">28.3</w:t>
-            </w:r>
-          </w:p>
-        </w:tc>
-      </w:tr>
-      <w:tr>
-        <w:trPr>
-          <w:cantSplit/>
-        </w:trPr>
-        <w:tc>
-          <w:tcPr>
-            <w:tcW w:w="1473" w:type="dxa"/>
-          </w:tcPr>
-          <w:p>
-            <w:pPr>
-              <w:pStyle w:val="TableText"/>
-              <w:jc w:val="left"/>
-              <w:wordWrap w:val="0"/>
-              <w:spacing w:before="0" w:after="0" w:line="320" w:lineRule="exact"/>
-            </w:pPr>
-            <w:r>
-              <w:rPr>
-                <w:rFonts w:ascii="Calibri" w:hAnsi="Calibri" w:eastAsia="Microsoft YaHei" w:cs="Calibri"/>
-                <w:sz w:val="18"/>
-                <w:szCs w:val="18"/>
-              </w:rPr>
-              <w:t xml:space="preserve">175%</w:t>
-            </w:r>
-          </w:p>
-        </w:tc>
-        <w:tc>
-          <w:tcPr>
-            <w:tcW w:w="1473" w:type="dxa"/>
-          </w:tcPr>
-          <w:p>
-            <w:pPr>
-              <w:pStyle w:val="TableText"/>
-              <w:jc w:val="left"/>
-              <w:wordWrap w:val="0"/>
-              <w:spacing w:before="0" w:after="0" w:line="320" w:lineRule="exact"/>
-            </w:pPr>
-            <w:r>
-              <w:rPr>
-                <w:rFonts w:ascii="Calibri" w:hAnsi="Calibri" w:eastAsia="Microsoft YaHei" w:cs="Calibri"/>
-                <w:sz w:val="18"/>
-                <w:szCs w:val="18"/>
-              </w:rPr>
-              <w:t xml:space="preserve">8N1S</w:t>
-            </w:r>
-          </w:p>
-        </w:tc>
-        <w:tc>
-          <w:tcPr>
-            <w:tcW w:w="1885" w:type="dxa"/>
-          </w:tcPr>
-          <w:p>
-            <w:pPr>
-              <w:pStyle w:val="TableText"/>
-              <w:jc w:val="left"/>
-              <w:wordWrap w:val="0"/>
-              <w:spacing w:before="0" w:after="0" w:line="320" w:lineRule="exact"/>
-            </w:pPr>
-            <w:r>
-              <w:rPr>
-                <w:rFonts w:ascii="Calibri" w:hAnsi="Calibri" w:eastAsia="Microsoft YaHei" w:cs="Calibri"/>
-                <w:sz w:val="18"/>
-                <w:szCs w:val="18"/>
-              </w:rPr>
-              <w:t xml:space="preserve">60.8%</w:t>
-            </w:r>
-          </w:p>
-        </w:tc>
-        <w:tc>
-          <w:tcPr>
-            <w:tcW w:w="4767" w:type="dxa"/>
-          </w:tcPr>
-          <w:p>
-            <w:pPr>
-              <w:pStyle w:val="TableText"/>
-              <w:jc w:val="left"/>
-              <w:wordWrap w:val="0"/>
-              <w:spacing w:before="0" w:after="0" w:line="320" w:lineRule="exact"/>
-            </w:pPr>
-            <w:r>
-              <w:rPr>
-                <w:rFonts w:ascii="Calibri" w:hAnsi="Calibri" w:eastAsia="Microsoft YaHei" w:cs="Calibri"/>
-                <w:sz w:val="18"/>
-                <w:szCs w:val="18"/>
-              </w:rPr>
-              <w:t xml:space="preserve">27.1</w:t>
-            </w:r>
-          </w:p>
-        </w:tc>
-      </w:tr>
-      <w:tr>
-        <w:trPr>
-          <w:cantSplit/>
-        </w:trPr>
-        <w:tc>
-          <w:tcPr>
-            <w:tcW w:w="1473" w:type="dxa"/>
-          </w:tcPr>
-          <w:p>
-            <w:pPr>
-              <w:pStyle w:val="TableText"/>
-              <w:jc w:val="left"/>
-              <w:wordWrap w:val="0"/>
-              <w:spacing w:before="0" w:after="0" w:line="320" w:lineRule="exact"/>
-            </w:pPr>
-            <w:r>
-              <w:rPr>
-                <w:rFonts w:ascii="Calibri" w:hAnsi="Calibri" w:eastAsia="Microsoft YaHei" w:cs="Calibri"/>
-                <w:sz w:val="18"/>
-                <w:szCs w:val="18"/>
-              </w:rPr>
-              <w:t xml:space="preserve">175%</w:t>
-            </w:r>
-          </w:p>
-        </w:tc>
-        <w:tc>
-          <w:tcPr>
-            <w:tcW w:w="1473" w:type="dxa"/>
-          </w:tcPr>
-          <w:p>
-            <w:pPr>
-              <w:pStyle w:val="TableText"/>
-              <w:jc w:val="left"/>
-              <w:wordWrap w:val="0"/>
-              <w:spacing w:before="0" w:after="0" w:line="320" w:lineRule="exact"/>
-            </w:pPr>
-            <w:r>
-              <w:rPr>
-                <w:rFonts w:ascii="Calibri" w:hAnsi="Calibri" w:eastAsia="Microsoft YaHei" w:cs="Calibri"/>
-                <w:sz w:val="18"/>
-                <w:szCs w:val="18"/>
-              </w:rPr>
-              <w:t xml:space="preserve">8N2S</w:t>
-            </w:r>
-          </w:p>
-        </w:tc>
-        <w:tc>
-          <w:tcPr>
-            <w:tcW w:w="1885" w:type="dxa"/>
-          </w:tcPr>
-          <w:p>
-            <w:pPr>
-              <w:pStyle w:val="TableText"/>
-              <w:jc w:val="left"/>
-              <w:wordWrap w:val="0"/>
-              <w:spacing w:before="0" w:after="0" w:line="320" w:lineRule="exact"/>
-            </w:pPr>
-            <w:r>
-              <w:rPr>
-                <w:rFonts w:ascii="Calibri" w:hAnsi="Calibri" w:eastAsia="Microsoft YaHei" w:cs="Calibri"/>
-                <w:sz w:val="18"/>
-                <w:szCs w:val="18"/>
-              </w:rPr>
-              <w:t xml:space="preserve">58.7%</w:t>
-            </w:r>
-          </w:p>
-        </w:tc>
-        <w:tc>
-          <w:tcPr>
-            <w:tcW w:w="4767" w:type="dxa"/>
-          </w:tcPr>
-          <w:p>
-            <w:pPr>
-              <w:pStyle w:val="TableText"/>
-              <w:jc w:val="left"/>
-              <w:wordWrap w:val="0"/>
-              <w:spacing w:before="0" w:after="0" w:line="320" w:lineRule="exact"/>
-            </w:pPr>
-            <w:r>
-              <w:rPr>
-                <w:rFonts w:ascii="Calibri" w:hAnsi="Calibri" w:eastAsia="Microsoft YaHei" w:cs="Calibri"/>
-                <w:sz w:val="18"/>
-                <w:szCs w:val="18"/>
-              </w:rPr>
-              <w:t xml:space="preserve">-9.2</w:t>
-            </w:r>
-          </w:p>
-        </w:tc>
-      </w:tr>
-      <w:tr>
-        <w:trPr>
-          <w:cantSplit/>
-        </w:trPr>
-        <w:tc>
-          <w:tcPr>
-            <w:tcW w:w="1473" w:type="dxa"/>
-          </w:tcPr>
-          <w:p>
-            <w:pPr>
-              <w:pStyle w:val="TableText"/>
-              <w:jc w:val="left"/>
-              <w:wordWrap w:val="0"/>
-              <w:spacing w:before="0" w:after="0" w:line="320" w:lineRule="exact"/>
-            </w:pPr>
-            <w:r>
-              <w:rPr>
-                <w:rFonts w:ascii="Calibri" w:hAnsi="Calibri" w:eastAsia="Microsoft YaHei" w:cs="Calibri"/>
-                <w:sz w:val="18"/>
-                <w:szCs w:val="18"/>
-              </w:rPr>
-              <w:t xml:space="preserve">175%</w:t>
-            </w:r>
-          </w:p>
-        </w:tc>
-        <w:tc>
-          <w:tcPr>
-            <w:tcW w:w="1473" w:type="dxa"/>
-          </w:tcPr>
-          <w:p>
-            <w:pPr>
-              <w:pStyle w:val="TableText"/>
-              <w:jc w:val="left"/>
-              <w:wordWrap w:val="0"/>
-              <w:spacing w:before="0" w:after="0" w:line="320" w:lineRule="exact"/>
-            </w:pPr>
-            <w:r>
-              <w:rPr>
-                <w:rFonts w:ascii="Calibri" w:hAnsi="Calibri" w:eastAsia="Microsoft YaHei" w:cs="Calibri"/>
-                <w:sz w:val="18"/>
-                <w:szCs w:val="18"/>
-              </w:rPr>
-              <w:t xml:space="preserve">16N1S</w:t>
-            </w:r>
-          </w:p>
-        </w:tc>
-        <w:tc>
-          <w:tcPr>
-            <w:tcW w:w="1885" w:type="dxa"/>
-          </w:tcPr>
-          <w:p>
-            <w:pPr>
-              <w:pStyle w:val="TableText"/>
-              <w:jc w:val="left"/>
-              <w:wordWrap w:val="0"/>
-              <w:spacing w:before="0" w:after="0" w:line="320" w:lineRule="exact"/>
-            </w:pPr>
-            <w:r>
-              <w:rPr>
-                <w:rFonts w:ascii="Calibri" w:hAnsi="Calibri" w:eastAsia="Microsoft YaHei" w:cs="Calibri"/>
-                <w:sz w:val="18"/>
-                <w:szCs w:val="18"/>
-              </w:rPr>
-              <w:t xml:space="preserve">86.7%</w:t>
-            </w:r>
-          </w:p>
-        </w:tc>
-        <w:tc>
-          <w:tcPr>
-            <w:tcW w:w="4767" w:type="dxa"/>
-          </w:tcPr>
-          <w:p>
-            <w:pPr>
-              <w:pStyle w:val="TableText"/>
-              <w:jc w:val="left"/>
-              <w:wordWrap w:val="0"/>
-              <w:spacing w:before="0" w:after="0" w:line="320" w:lineRule="exact"/>
-            </w:pPr>
-            <w:r>
-              <w:rPr>
-                <w:rFonts w:ascii="Calibri" w:hAnsi="Calibri" w:eastAsia="Microsoft YaHei" w:cs="Calibri"/>
-                <w:sz w:val="18"/>
-                <w:szCs w:val="18"/>
-              </w:rPr>
-              <w:t xml:space="preserve">50.7</w:t>
-            </w:r>
-          </w:p>
-        </w:tc>
-      </w:tr>
-      <w:tr>
-        <w:trPr>
-          <w:cantSplit/>
-        </w:trPr>
-        <w:tc>
-          <w:tcPr>
-            <w:tcW w:w="1473" w:type="dxa"/>
+            <w:tcW w:w="1490" w:type="dxa"/>
           </w:tcPr>
           <w:p>
             <w:pPr>
@@ -9438,420 +9093,64 @@
         </w:tc>
         <w:tc>
           <w:tcPr>
-            <w:tcW w:w="1473" w:type="dxa"/>
-          </w:tcPr>
-          <w:p>
-            <w:pPr>
-              <w:pStyle w:val="TableText"/>
-              <w:jc w:val="left"/>
-              <w:wordWrap w:val="0"/>
-              <w:spacing w:before="0" w:after="0" w:line="320" w:lineRule="exact"/>
-            </w:pPr>
-            <w:r>
-              <w:rPr>
-                <w:rFonts w:ascii="Calibri" w:hAnsi="Calibri" w:eastAsia="Microsoft YaHei" w:cs="Calibri"/>
-                <w:sz w:val="18"/>
-                <w:szCs w:val="18"/>
-              </w:rPr>
-              <w:t xml:space="preserve">3N1S</w:t>
-            </w:r>
-          </w:p>
-        </w:tc>
-        <w:tc>
-          <w:tcPr>
-            <w:tcW w:w="1885" w:type="dxa"/>
-          </w:tcPr>
-          <w:p>
-            <w:pPr>
-              <w:pStyle w:val="TableText"/>
-              <w:jc w:val="left"/>
-              <w:wordWrap w:val="0"/>
-              <w:spacing w:before="0" w:after="0" w:line="320" w:lineRule="exact"/>
-            </w:pPr>
-            <w:r>
-              <w:rPr>
-                <w:rFonts w:ascii="Calibri" w:hAnsi="Calibri" w:eastAsia="Microsoft YaHei" w:cs="Calibri"/>
-                <w:sz w:val="18"/>
-                <w:szCs w:val="18"/>
-              </w:rPr>
-              <w:t xml:space="preserve">93.1%</w:t>
-            </w:r>
-          </w:p>
-        </w:tc>
-        <w:tc>
-          <w:tcPr>
-            <w:tcW w:w="4767" w:type="dxa"/>
-          </w:tcPr>
-          <w:p>
-            <w:pPr>
-              <w:pStyle w:val="TableText"/>
-              <w:jc w:val="left"/>
-              <w:wordWrap w:val="0"/>
-              <w:spacing w:before="0" w:after="0" w:line="320" w:lineRule="exact"/>
-            </w:pPr>
-            <w:r>
-              <w:rPr>
-                <w:rFonts w:ascii="Calibri" w:hAnsi="Calibri" w:eastAsia="Microsoft YaHei" w:cs="Calibri"/>
-                <w:sz w:val="18"/>
-                <w:szCs w:val="18"/>
-              </w:rPr>
-              <w:t xml:space="preserve">25.0</w:t>
-            </w:r>
-          </w:p>
-        </w:tc>
-      </w:tr>
-      <w:tr>
-        <w:trPr>
-          <w:cantSplit/>
-        </w:trPr>
-        <w:tc>
-          <w:tcPr>
-            <w:tcW w:w="1473" w:type="dxa"/>
-          </w:tcPr>
-          <w:p>
-            <w:pPr>
-              <w:pStyle w:val="TableText"/>
-              <w:jc w:val="left"/>
-              <w:wordWrap w:val="0"/>
-              <w:spacing w:before="0" w:after="0" w:line="320" w:lineRule="exact"/>
-            </w:pPr>
-            <w:r>
-              <w:rPr>
-                <w:rFonts w:ascii="Calibri" w:hAnsi="Calibri" w:eastAsia="Microsoft YaHei" w:cs="Calibri"/>
-                <w:sz w:val="18"/>
-                <w:szCs w:val="18"/>
-              </w:rPr>
-              <w:t xml:space="preserve">200%</w:t>
-            </w:r>
-          </w:p>
-        </w:tc>
-        <w:tc>
-          <w:tcPr>
-            <w:tcW w:w="1473" w:type="dxa"/>
-          </w:tcPr>
-          <w:p>
-            <w:pPr>
-              <w:pStyle w:val="TableText"/>
-              <w:jc w:val="left"/>
-              <w:wordWrap w:val="0"/>
-              <w:spacing w:before="0" w:after="0" w:line="320" w:lineRule="exact"/>
-            </w:pPr>
-            <w:r>
-              <w:rPr>
-                <w:rFonts w:ascii="Calibri" w:hAnsi="Calibri" w:eastAsia="Microsoft YaHei" w:cs="Calibri"/>
-                <w:sz w:val="18"/>
-                <w:szCs w:val="18"/>
-              </w:rPr>
-              <w:t xml:space="preserve">3N2S</w:t>
-            </w:r>
-          </w:p>
-        </w:tc>
-        <w:tc>
-          <w:tcPr>
-            <w:tcW w:w="1885" w:type="dxa"/>
-          </w:tcPr>
-          <w:p>
-            <w:pPr>
-              <w:pStyle w:val="TableText"/>
-              <w:jc w:val="left"/>
-              <w:wordWrap w:val="0"/>
-              <w:spacing w:before="0" w:after="0" w:line="320" w:lineRule="exact"/>
-            </w:pPr>
-            <w:r>
-              <w:rPr>
-                <w:rFonts w:ascii="Calibri" w:hAnsi="Calibri" w:eastAsia="Microsoft YaHei" w:cs="Calibri"/>
-                <w:sz w:val="18"/>
-                <w:szCs w:val="18"/>
-              </w:rPr>
-              <w:t xml:space="preserve">90.9%</w:t>
-            </w:r>
-          </w:p>
-        </w:tc>
-        <w:tc>
-          <w:tcPr>
-            <w:tcW w:w="4767" w:type="dxa"/>
-          </w:tcPr>
-          <w:p>
-            <w:pPr>
-              <w:pStyle w:val="TableText"/>
-              <w:jc w:val="left"/>
-              <w:wordWrap w:val="0"/>
-              <w:spacing w:before="0" w:after="0" w:line="320" w:lineRule="exact"/>
-            </w:pPr>
-            <w:r>
-              <w:rPr>
-                <w:rFonts w:ascii="Calibri" w:hAnsi="Calibri" w:eastAsia="Microsoft YaHei" w:cs="Calibri"/>
-                <w:sz w:val="18"/>
-                <w:szCs w:val="18"/>
-              </w:rPr>
-              <w:t xml:space="preserve">27.4</w:t>
-            </w:r>
-          </w:p>
-        </w:tc>
-      </w:tr>
-      <w:tr>
-        <w:trPr>
-          <w:cantSplit/>
-        </w:trPr>
-        <w:tc>
-          <w:tcPr>
-            <w:tcW w:w="1473" w:type="dxa"/>
-          </w:tcPr>
-          <w:p>
-            <w:pPr>
-              <w:pStyle w:val="TableText"/>
-              <w:jc w:val="left"/>
-              <w:wordWrap w:val="0"/>
-              <w:spacing w:before="0" w:after="0" w:line="320" w:lineRule="exact"/>
-            </w:pPr>
-            <w:r>
-              <w:rPr>
-                <w:rFonts w:ascii="Calibri" w:hAnsi="Calibri" w:eastAsia="Microsoft YaHei" w:cs="Calibri"/>
-                <w:sz w:val="18"/>
-                <w:szCs w:val="18"/>
-              </w:rPr>
-              <w:t xml:space="preserve">200%</w:t>
-            </w:r>
-          </w:p>
-        </w:tc>
-        <w:tc>
-          <w:tcPr>
-            <w:tcW w:w="1473" w:type="dxa"/>
-          </w:tcPr>
-          <w:p>
-            <w:pPr>
-              <w:pStyle w:val="TableText"/>
-              <w:jc w:val="left"/>
-              <w:wordWrap w:val="0"/>
-              <w:spacing w:before="0" w:after="0" w:line="320" w:lineRule="exact"/>
-            </w:pPr>
-            <w:r>
-              <w:rPr>
-                <w:rFonts w:ascii="Calibri" w:hAnsi="Calibri" w:eastAsia="Microsoft YaHei" w:cs="Calibri"/>
-                <w:sz w:val="18"/>
-                <w:szCs w:val="18"/>
-              </w:rPr>
-              <w:t xml:space="preserve">8N1S</w:t>
-            </w:r>
-          </w:p>
-        </w:tc>
-        <w:tc>
-          <w:tcPr>
-            <w:tcW w:w="1885" w:type="dxa"/>
-          </w:tcPr>
-          <w:p>
-            <w:pPr>
-              <w:pStyle w:val="TableText"/>
-              <w:jc w:val="left"/>
-              <w:wordWrap w:val="0"/>
-              <w:spacing w:before="0" w:after="0" w:line="320" w:lineRule="exact"/>
-            </w:pPr>
-            <w:r>
-              <w:rPr>
-                <w:rFonts w:ascii="Calibri" w:hAnsi="Calibri" w:eastAsia="Microsoft YaHei" w:cs="Calibri"/>
-                <w:sz w:val="18"/>
-                <w:szCs w:val="18"/>
-              </w:rPr>
-              <w:t xml:space="preserve">88.0%</w:t>
-            </w:r>
-          </w:p>
-        </w:tc>
-        <w:tc>
-          <w:tcPr>
-            <w:tcW w:w="4767" w:type="dxa"/>
-          </w:tcPr>
-          <w:p>
-            <w:pPr>
-              <w:pStyle w:val="TableText"/>
-              <w:jc w:val="left"/>
-              <w:wordWrap w:val="0"/>
-              <w:spacing w:before="0" w:after="0" w:line="320" w:lineRule="exact"/>
-            </w:pPr>
-            <w:r>
-              <w:rPr>
-                <w:rFonts w:ascii="Calibri" w:hAnsi="Calibri" w:eastAsia="Microsoft YaHei" w:cs="Calibri"/>
-                <w:sz w:val="18"/>
-                <w:szCs w:val="18"/>
-              </w:rPr>
-              <w:t xml:space="preserve">26.1</w:t>
-            </w:r>
-          </w:p>
-        </w:tc>
-      </w:tr>
-      <w:tr>
-        <w:trPr>
-          <w:cantSplit/>
-        </w:trPr>
-        <w:tc>
-          <w:tcPr>
-            <w:tcW w:w="1473" w:type="dxa"/>
-          </w:tcPr>
-          <w:p>
-            <w:pPr>
-              <w:pStyle w:val="TableText"/>
-              <w:jc w:val="left"/>
-              <w:wordWrap w:val="0"/>
-              <w:spacing w:before="0" w:after="0" w:line="320" w:lineRule="exact"/>
-            </w:pPr>
-            <w:r>
-              <w:rPr>
-                <w:rFonts w:ascii="Calibri" w:hAnsi="Calibri" w:eastAsia="Microsoft YaHei" w:cs="Calibri"/>
-                <w:sz w:val="18"/>
-                <w:szCs w:val="18"/>
-              </w:rPr>
-              <w:t xml:space="preserve">200%</w:t>
-            </w:r>
-          </w:p>
-        </w:tc>
-        <w:tc>
-          <w:tcPr>
-            <w:tcW w:w="1473" w:type="dxa"/>
-          </w:tcPr>
-          <w:p>
-            <w:pPr>
-              <w:pStyle w:val="TableText"/>
-              <w:jc w:val="left"/>
-              <w:wordWrap w:val="0"/>
-              <w:spacing w:before="0" w:after="0" w:line="320" w:lineRule="exact"/>
-            </w:pPr>
-            <w:r>
-              <w:rPr>
-                <w:rFonts w:ascii="Calibri" w:hAnsi="Calibri" w:eastAsia="Microsoft YaHei" w:cs="Calibri"/>
-                <w:sz w:val="18"/>
-                <w:szCs w:val="18"/>
-              </w:rPr>
-              <w:t xml:space="preserve">8N2S</w:t>
-            </w:r>
-          </w:p>
-        </w:tc>
-        <w:tc>
-          <w:tcPr>
-            <w:tcW w:w="1885" w:type="dxa"/>
-          </w:tcPr>
-          <w:p>
-            <w:pPr>
-              <w:pStyle w:val="TableText"/>
-              <w:jc w:val="left"/>
-              <w:wordWrap w:val="0"/>
-              <w:spacing w:before="0" w:after="0" w:line="320" w:lineRule="exact"/>
-            </w:pPr>
-            <w:r>
-              <w:rPr>
-                <w:rFonts w:ascii="Calibri" w:hAnsi="Calibri" w:eastAsia="Microsoft YaHei" w:cs="Calibri"/>
-                <w:sz w:val="18"/>
-                <w:szCs w:val="18"/>
-              </w:rPr>
-              <w:t xml:space="preserve">86.9%</w:t>
-            </w:r>
-          </w:p>
-        </w:tc>
-        <w:tc>
-          <w:tcPr>
-            <w:tcW w:w="4767" w:type="dxa"/>
-          </w:tcPr>
-          <w:p>
-            <w:pPr>
-              <w:pStyle w:val="TableText"/>
-              <w:jc w:val="left"/>
-              <w:wordWrap w:val="0"/>
-              <w:spacing w:before="0" w:after="0" w:line="320" w:lineRule="exact"/>
-            </w:pPr>
-            <w:r>
-              <w:rPr>
-                <w:rFonts w:ascii="Calibri" w:hAnsi="Calibri" w:eastAsia="Microsoft YaHei" w:cs="Calibri"/>
-                <w:sz w:val="18"/>
-                <w:szCs w:val="18"/>
-              </w:rPr>
-              <w:t xml:space="preserve">1.9</w:t>
-            </w:r>
-          </w:p>
-        </w:tc>
-      </w:tr>
-      <w:tr>
-        <w:trPr>
-          <w:cantSplit/>
-        </w:trPr>
-        <w:tc>
-          <w:tcPr>
-            <w:tcW w:w="1473" w:type="dxa"/>
-          </w:tcPr>
-          <w:p>
-            <w:pPr>
-              <w:pStyle w:val="TableText"/>
-              <w:jc w:val="left"/>
-              <w:wordWrap w:val="0"/>
-              <w:spacing w:before="0" w:after="0" w:line="320" w:lineRule="exact"/>
-            </w:pPr>
-            <w:r>
-              <w:rPr>
-                <w:rFonts w:ascii="Calibri" w:hAnsi="Calibri" w:eastAsia="Microsoft YaHei" w:cs="Calibri"/>
-                <w:sz w:val="18"/>
-                <w:szCs w:val="18"/>
-              </w:rPr>
-              <w:t xml:space="preserve">200%</w:t>
-            </w:r>
-          </w:p>
-        </w:tc>
-        <w:tc>
-          <w:tcPr>
-            <w:tcW w:w="1473" w:type="dxa"/>
-          </w:tcPr>
-          <w:p>
-            <w:pPr>
-              <w:pStyle w:val="TableText"/>
-              <w:jc w:val="left"/>
-              <w:wordWrap w:val="0"/>
-              <w:spacing w:before="0" w:after="0" w:line="320" w:lineRule="exact"/>
-            </w:pPr>
-            <w:r>
-              <w:rPr>
-                <w:rFonts w:ascii="Calibri" w:hAnsi="Calibri" w:eastAsia="Microsoft YaHei" w:cs="Calibri"/>
-                <w:sz w:val="18"/>
-                <w:szCs w:val="18"/>
-              </w:rPr>
-              <w:t xml:space="preserve">16N1S</w:t>
-            </w:r>
-          </w:p>
-        </w:tc>
-        <w:tc>
-          <w:tcPr>
-            <w:tcW w:w="1885" w:type="dxa"/>
-          </w:tcPr>
-          <w:p>
-            <w:pPr>
-              <w:pStyle w:val="TableText"/>
-              <w:jc w:val="left"/>
-              <w:wordWrap w:val="0"/>
-              <w:spacing w:before="0" w:after="0" w:line="320" w:lineRule="exact"/>
-            </w:pPr>
-            <w:r>
-              <w:rPr>
-                <w:rFonts w:ascii="Calibri" w:hAnsi="Calibri" w:eastAsia="Microsoft YaHei" w:cs="Calibri"/>
-                <w:sz w:val="18"/>
-                <w:szCs w:val="18"/>
-              </w:rPr>
-              <w:t xml:space="preserve">120.5%</w:t>
-            </w:r>
-          </w:p>
-        </w:tc>
-        <w:tc>
-          <w:tcPr>
-            <w:tcW w:w="4767" w:type="dxa"/>
-          </w:tcPr>
-          <w:p>
-            <w:pPr>
-              <w:pStyle w:val="TableText"/>
-              <w:jc w:val="left"/>
-              <w:wordWrap w:val="0"/>
-              <w:spacing w:before="0" w:after="0" w:line="320" w:lineRule="exact"/>
-            </w:pPr>
-            <w:r>
-              <w:rPr>
-                <w:rFonts w:ascii="Calibri" w:hAnsi="Calibri" w:eastAsia="Microsoft YaHei" w:cs="Calibri"/>
-                <w:sz w:val="18"/>
-                <w:szCs w:val="18"/>
-              </w:rPr>
-              <w:t xml:space="preserve">57.4</w:t>
+            <w:tcW w:w="2050" w:type="dxa"/>
+          </w:tcPr>
+          <w:p>
+            <w:pPr>
+              <w:pStyle w:val="TableText"/>
+              <w:jc w:val="left"/>
+              <w:wordWrap w:val="0"/>
+              <w:spacing w:before="0" w:after="0" w:line="320" w:lineRule="exact"/>
+            </w:pPr>
+            <w:r>
+              <w:rPr>
+                <w:rFonts w:ascii="Calibri" w:hAnsi="Calibri" w:eastAsia="Microsoft YaHei" w:cs="Calibri"/>
+                <w:sz w:val="18"/>
+                <w:szCs w:val="18"/>
+              </w:rPr>
+              <w:t xml:space="preserve">30 / 90</w:t>
+            </w:r>
+          </w:p>
+        </w:tc>
+        <w:tc>
+          <w:tcPr>
+            <w:tcW w:w="1630" w:type="dxa"/>
+          </w:tcPr>
+          <w:p>
+            <w:pPr>
+              <w:pStyle w:val="TableText"/>
+              <w:jc w:val="left"/>
+              <w:wordWrap w:val="0"/>
+              <w:spacing w:before="0" w:after="0" w:line="320" w:lineRule="exact"/>
+            </w:pPr>
+            <w:r>
+              <w:rPr>
+                <w:rFonts w:ascii="Calibri" w:hAnsi="Calibri" w:eastAsia="Microsoft YaHei" w:cs="Calibri"/>
+                <w:sz w:val="18"/>
+                <w:szCs w:val="18"/>
+              </w:rPr>
+              <w:t xml:space="preserve">1.954×</w:t>
+            </w:r>
+          </w:p>
+        </w:tc>
+        <w:tc>
+          <w:tcPr>
+            <w:tcW w:w="4430" w:type="dxa"/>
+          </w:tcPr>
+          <w:p>
+            <w:pPr>
+              <w:pStyle w:val="TableText"/>
+              <w:jc w:val="left"/>
+              <w:wordWrap w:val="0"/>
+              <w:spacing w:before="0" w:after="0" w:line="320" w:lineRule="exact"/>
+            </w:pPr>
+            <w:r>
+              <w:rPr>
+                <w:rFonts w:ascii="Calibri" w:hAnsi="Calibri" w:eastAsia="Microsoft YaHei" w:cs="Calibri"/>
+                <w:sz w:val="18"/>
+                <w:szCs w:val="18"/>
+              </w:rPr>
+              <w:t xml:space="preserve">27.573</w:t>
             </w:r>
           </w:p>
         </w:tc>
@@ -9859,13 +9158,57 @@
     </w:tbl>
     <w:p>
       <w:pPr>
+        <w:ind w:left="0" w:firstLine="420"/>
+      </w:pPr>
+      <w:r>
+        <w:rPr>
+          <w:rFonts w:ascii="Calibri" w:hAnsi="Calibri" w:eastAsia="Microsoft YaHei" w:cs="Calibri"/>
+        </w:rPr>
+        <w:t xml:space="preserve">超大 ResidentDir 参考仍有非零 H64 live，属于扩展参考，不宣称满足 Formal IdealDi⁠r⁠ ⁠资⁠格⁠。</w:t>
+      </w:r>
+    </w:p>
+    <w:p>
+      <w:pPr>
+        <w:ind w:left="0" w:firstLine="420"/>
+      </w:pPr>
+      <w:r>
+        <w:rPr>
+          <w:rFonts w:ascii="Calibri" w:hAnsi="Calibri" w:eastAsia="Microsoft YaHei" w:cs="Calibri"/>
+        </w:rPr>
+        <w:t xml:space="preserve">数值源 performance_extension_data.json 保留逐臂原始 Outer 延迟频数、进程事件数、⁠计⁠时⁠记⁠录⁠、</w:t>
+      </w:r>
+    </w:p>
+    <w:p>
+      <w:pPr>
+        <w:ind w:left="0" w:firstLine="420"/>
+      </w:pPr>
+      <w:r>
+        <w:rPr>
+          <w:rFonts w:ascii="Calibri" w:hAnsi="Calibri" w:eastAsia="Microsoft YaHei" w:cs="Calibri"/>
+        </w:rPr>
+        <w:t xml:space="preserve">Home0/socket0 统计、PASS manifest 和源文件 SHA-256；压缩与普通日志均按⁠进⁠程⁠读⁠取⁠，</w:t>
+      </w:r>
+    </w:p>
+    <w:p>
+      <w:pPr>
+        <w:ind w:left="0" w:firstLine="420"/>
+      </w:pPr>
+      <w:r>
+        <w:rPr>
+          <w:rFonts w:ascii="Calibri" w:hAnsi="Calibri" w:eastAsia="Microsoft YaHei" w:cs="Calibri"/>
+        </w:rPr>
+        <w:t xml:space="preserve">不以相同文本去重事件，也不对节点均⁠值⁠再⁠平⁠均⁠。</w:t>
+      </w:r>
+    </w:p>
+    <w:p>
+      <w:pPr>
         <w:jc w:val="center"/>
         <w:spacing w:before="100" w:after="40" w:line="240" w:lineRule="auto"/>
       </w:pPr>
       <w:r>
         <w:drawing>
           <wp:inline distT="0" distB="0" distL="0" distR="0">
-            <wp:extent cx="4320000" cy="2399206"/>
+            <wp:extent cx="5580000" cy="3385480"/>
             <wp:effectExtent l="0" t="0" r="0" b="0"/>
             <wp:docPr id="3" name="图 3-3 指标 1 多压力与多拓扑扩展观测" descr="图 3-3 指标 1 多压力与多拓扑扩展观测"/>
             <wp:cNvGraphicFramePr>
@@ -9887,7 +9230,7 @@
                   <pic:spPr>
                     <a:xfrm>
                       <a:off x="0" y="0"/>
-                      <a:ext cx="4320000" cy="2399206"/>
+                      <a:ext cx="5580000" cy="3385480"/>
                     </a:xfrm>
                     <a:prstGeom prst="rect">
                       <a:avLst/>
@@ -9934,6 +9277,41 @@
           <w:rFonts w:ascii="Calibri" w:hAnsi="Calibri" w:eastAsia="SimHei" w:cs="Calibri"/>
         </w:rPr>
         <w:t xml:space="preserve">4.1 场景结果</w:t>
+      </w:r>
+    </w:p>
+    <w:p>
+      <w:pPr>
+        <w:ind w:left="0" w:firstLine="420"/>
+      </w:pPr>
+      <w:r>
+        <w:rPr>
+          <w:rFonts w:ascii="Calibri" w:hAnsi="Calibri" w:eastAsia="Microsoft YaHei" w:cs="Calibri"/>
+        </w:rPr>
+        <w:t xml:space="preserve">本节及图 4-1 使用 2026-09-07 新单轮 21 次运行，比较臂仍为 optimized vs naive。</w:t>
+      </w:r>
+    </w:p>
+    <w:p>
+      <w:pPr>
+        <w:ind w:left="0" w:firstLine="420"/>
+      </w:pPr>
+      <w:r>
+        <w:rPr>
+          <w:rFonts w:ascii="Calibri" w:hAnsi="Calibri" w:eastAsia="Microsoft YaHei" w:cs="Calibri"/>
+        </w:rPr>
+        <w:t xml:space="preserve">历⁠史⁠三⁠轮⁠的⁠ </w:t>
+      </w:r>
+      <w:r>
+        <w:rPr>
+          <w:rFonts w:ascii="Calibri" w:hAnsi="Calibri" w:eastAsia="Microsoft YaHei" w:cs="Calibri"/>
+          <w:b/>
+        </w:rPr>
+        <w:t xml:space="preserve">64.759%</w:t>
+      </w:r>
+      <w:r>
+        <w:rPr>
+          <w:rFonts w:ascii="Calibri" w:hAnsi="Calibri" w:eastAsia="Microsoft YaHei" w:cs="Calibri"/>
+        </w:rPr>
+        <w:t xml:space="preserve"> 保留在执行摘要，历史 TC138 降幅为 -13.333%；以下新值不是⁠三⁠轮⁠复⁠测⁠。</w:t>
       </w:r>
     </w:p>
     <w:tbl>
@@ -10118,7 +9496,7 @@
                 <w:sz w:val="18"/>
                 <w:szCs w:val="18"/>
               </w:rPr>
-              <w:t xml:space="preserve">2344.449</w:t>
+              <w:t xml:space="preserve">2423.922</w:t>
             </w:r>
           </w:p>
         </w:tc>
@@ -10181,7 +9559,7 @@
                 <w:sz w:val="18"/>
                 <w:szCs w:val="18"/>
               </w:rPr>
-              <w:t xml:space="preserve">98.305%</w:t>
+              <w:t xml:space="preserve">98.361%</w:t>
             </w:r>
           </w:p>
         </w:tc>
@@ -10228,7 +9606,7 @@
                 <w:sz w:val="18"/>
                 <w:szCs w:val="18"/>
               </w:rPr>
-              <w:t xml:space="preserve">2384.186</w:t>
+              <w:t xml:space="preserve">2463.659</w:t>
             </w:r>
           </w:p>
         </w:tc>
@@ -10249,33 +9627,33 @@
                 <w:sz w:val="18"/>
                 <w:szCs w:val="18"/>
               </w:rPr>
+              <w:t xml:space="preserve">39.736</w:t>
+            </w:r>
+          </w:p>
+        </w:tc>
+        <w:tc>
+          <w:tcPr>
+            <w:tcW w:w="1770" w:type="dxa"/>
+          </w:tcPr>
+          <w:p>
+            <w:pPr>
+              <w:pStyle w:val="TableText"/>
+              <w:jc w:val="left"/>
+              <w:wordWrap w:val="0"/>
+              <w:spacing w:before="0" w:after="0" w:line="320" w:lineRule="exact"/>
+            </w:pPr>
+            <w:r>
+              <w:rPr>
+                <w:rFonts w:ascii="Calibri" w:hAnsi="Calibri" w:eastAsia="Microsoft YaHei" w:cs="Calibri"/>
+                <w:sz w:val="18"/>
+                <w:szCs w:val="18"/>
+              </w:rPr>
               <w:t xml:space="preserve">79.473</w:t>
             </w:r>
           </w:p>
         </w:tc>
         <w:tc>
           <w:tcPr>
-            <w:tcW w:w="1770" w:type="dxa"/>
-          </w:tcPr>
-          <w:p>
-            <w:pPr>
-              <w:pStyle w:val="TableText"/>
-              <w:jc w:val="left"/>
-              <w:wordWrap w:val="0"/>
-              <w:spacing w:before="0" w:after="0" w:line="320" w:lineRule="exact"/>
-            </w:pPr>
-            <w:r>
-              <w:rPr>
-                <w:rFonts w:ascii="Calibri" w:hAnsi="Calibri" w:eastAsia="Microsoft YaHei" w:cs="Calibri"/>
-                <w:sz w:val="18"/>
-                <w:szCs w:val="18"/>
-              </w:rPr>
-              <w:t xml:space="preserve">79.473</w:t>
-            </w:r>
-          </w:p>
-        </w:tc>
-        <w:tc>
-          <w:tcPr>
             <w:tcW w:w="1546" w:type="dxa"/>
           </w:tcPr>
           <w:p>
@@ -10291,7 +9669,7 @@
                 <w:sz w:val="18"/>
                 <w:szCs w:val="18"/>
               </w:rPr>
-              <w:t xml:space="preserve">96.667%</w:t>
+              <w:t xml:space="preserve">96.774%</w:t>
             </w:r>
           </w:p>
         </w:tc>
@@ -10338,7 +9716,7 @@
                 <w:sz w:val="18"/>
                 <w:szCs w:val="18"/>
               </w:rPr>
-              <w:t xml:space="preserve">2384.186</w:t>
+              <w:t xml:space="preserve">2423.922</w:t>
             </w:r>
           </w:p>
         </w:tc>
@@ -10359,7 +9737,7 @@
                 <w:sz w:val="18"/>
                 <w:szCs w:val="18"/>
               </w:rPr>
-              <w:t xml:space="preserve">1788.139</w:t>
+              <w:t xml:space="preserve">1867.612</w:t>
             </w:r>
           </w:p>
         </w:tc>
@@ -10380,7 +9758,7 @@
                 <w:sz w:val="18"/>
                 <w:szCs w:val="18"/>
               </w:rPr>
-              <w:t xml:space="preserve">1788.139</w:t>
+              <w:t xml:space="preserve">1867.612</w:t>
             </w:r>
           </w:p>
         </w:tc>
@@ -10401,7 +9779,7 @@
                 <w:sz w:val="18"/>
                 <w:szCs w:val="18"/>
               </w:rPr>
-              <w:t xml:space="preserve">25.000%</w:t>
+              <w:t xml:space="preserve">22.951%</w:t>
             </w:r>
           </w:p>
         </w:tc>
@@ -10448,7 +9826,7 @@
                 <w:sz w:val="18"/>
                 <w:szCs w:val="18"/>
               </w:rPr>
-              <w:t xml:space="preserve">2384.186</w:t>
+              <w:t xml:space="preserve">2463.659</w:t>
             </w:r>
           </w:p>
         </w:tc>
@@ -10511,7 +9889,7 @@
                 <w:sz w:val="18"/>
                 <w:szCs w:val="18"/>
               </w:rPr>
-              <w:t xml:space="preserve">-13.333%</w:t>
+              <w:t xml:space="preserve">-9.677%</w:t>
             </w:r>
           </w:p>
         </w:tc>
@@ -10558,7 +9936,7 @@
                 <w:sz w:val="18"/>
                 <w:szCs w:val="18"/>
               </w:rPr>
-              <w:t xml:space="preserve">23563.703</w:t>
+              <w:t xml:space="preserve">24199.486</w:t>
             </w:r>
           </w:p>
         </w:tc>
@@ -10621,7 +9999,7 @@
                 <w:sz w:val="18"/>
                 <w:szCs w:val="18"/>
               </w:rPr>
-              <w:t xml:space="preserve">97.302%</w:t>
+              <w:t xml:space="preserve">97.373%</w:t>
             </w:r>
           </w:p>
         </w:tc>
@@ -10668,7 +10046,7 @@
                 <w:sz w:val="18"/>
                 <w:szCs w:val="18"/>
               </w:rPr>
-              <w:t xml:space="preserve">4132.589</w:t>
+              <w:t xml:space="preserve">4251.798</w:t>
             </w:r>
           </w:p>
         </w:tc>
@@ -10689,7 +10067,7 @@
                 <w:sz w:val="18"/>
                 <w:szCs w:val="18"/>
               </w:rPr>
-              <w:t xml:space="preserve">635.783</w:t>
+              <w:t xml:space="preserve">596.046</w:t>
             </w:r>
           </w:p>
         </w:tc>
@@ -10710,7 +10088,7 @@
                 <w:sz w:val="18"/>
                 <w:szCs w:val="18"/>
               </w:rPr>
-              <w:t xml:space="preserve">635.783</w:t>
+              <w:t xml:space="preserve">596.046</w:t>
             </w:r>
           </w:p>
         </w:tc>
@@ -10731,7 +10109,7 @@
                 <w:sz w:val="18"/>
                 <w:szCs w:val="18"/>
               </w:rPr>
-              <w:t xml:space="preserve">84.615%</w:t>
+              <w:t xml:space="preserve">85.981%</w:t>
             </w:r>
           </w:p>
         </w:tc>
@@ -10778,7 +10156,7 @@
       <w:r>
         <w:drawing>
           <wp:inline distT="0" distB="0" distL="0" distR="0">
-            <wp:extent cx="3960000" cy="1789090"/>
+            <wp:extent cx="3960000" cy="1841917"/>
             <wp:effectExtent l="0" t="0" r="0" b="0"/>
             <wp:docPr id="4" name="图 4-1 指标 2 适用场景端到端时延" descr="图 4-1 指标 2 适用场景端到端时延"/>
             <wp:cNvGraphicFramePr>
@@ -10800,7 +10178,7 @@
                   <pic:spPr>
                     <a:xfrm>
                       <a:off x="0" y="0"/>
-                      <a:ext cx="3960000" cy="1789090"/>
+                      <a:ext cx="3960000" cy="1841917"/>
                     </a:xfrm>
                     <a:prstGeom prst="rect">
                       <a:avLst/>
@@ -10822,7 +10200,18 @@
         <w:rPr>
           <w:rFonts w:ascii="Calibri" w:hAnsi="Calibri" w:eastAsia="Microsoft YaHei" w:cs="Calibri"/>
         </w:rPr>
-        <w:t xml:space="preserve">图 4-1　指标 2 场景时延</w:t>
+        <w:t xml:space="preserve">图 4-1　指标 2 原场景单轮 speedup（naive / optimized，对数轴）；参考线 1× 与</w:t>
+      </w:r>
+    </w:p>
+    <w:p>
+      <w:pPr>
+        <w:ind w:left="0" w:firstLine="420"/>
+      </w:pPr>
+      <w:r>
+        <w:rPr>
+          <w:rFonts w:ascii="Calibri" w:hAnsi="Calibri" w:eastAsia="Microsoft YaHei" w:cs="Calibri"/>
+        </w:rPr>
+        <w:t xml:space="preserve">1/0.9×（时延下降 10%）。适用 TC 等权 GM 仅用于图示，不是正式 AM ⁠降⁠幅⁠判⁠据⁠。</w:t>
       </w:r>
     </w:p>
     <w:p>
@@ -10845,20 +10234,20 @@
         <w:rPr>
           <w:rFonts w:ascii="Calibri" w:hAnsi="Calibri" w:eastAsia="Microsoft YaHei" w:cs="Calibri"/>
         </w:rPr>
-        <w:t xml:space="preserve">六个适用场景的 case-level 等权平⁠均⁠降⁠幅⁠为⁠ </w:t>
+        <w:t xml:space="preserve">六个适用场景的新单轮 case-level 等权算术平⁠均⁠降⁠幅⁠为⁠ </w:t>
       </w:r>
       <w:r>
         <w:rPr>
           <w:rFonts w:ascii="Calibri" w:hAnsi="Calibri" w:eastAsia="Microsoft YaHei" w:cs="Calibri"/>
           <w:b/>
         </w:rPr>
-        <w:t xml:space="preserve">64.759%</w:t>
+        <w:t xml:space="preserve">65.294%</w:t>
       </w:r>
       <w:r>
         <w:rPr>
           <w:rFonts w:ascii="Calibri" w:hAnsi="Calibri" w:eastAsia="Microsoft YaHei" w:cs="Calibri"/>
         </w:rPr>
-        <w:t xml:space="preserve">。</w:t>
+        <w:t xml:space="preserve">，未舍入值保留⁠在⁠数⁠值⁠源⁠。</w:t>
       </w:r>
     </w:p>
     <w:p>
@@ -10992,7 +10381,7 @@
         <w:rPr>
           <w:rFonts w:ascii="Calibri" w:hAnsi="Calibri" w:eastAsia="Microsoft YaHei" w:cs="Calibri"/>
         </w:rPr>
-        <w:t xml:space="preserve">指标 2 的适用场景等权平均降幅为 64.759%，超过 10% ⁠合⁠同⁠门⁠槛⁠。</w:t>
+        <w:t xml:space="preserve">新单轮的适用场景等权平均降幅为 65.294%，超过 10% 数值门槛；不替代历史三轮⁠正⁠式⁠验⁠收⁠。</w:t>
       </w:r>
     </w:p>
     <w:p>
@@ -12455,7 +11844,7 @@
         <w:rPr>
           <w:rFonts w:ascii="Calibri" w:hAnsi="Calibri" w:eastAsia="SimHei" w:cs="Calibri"/>
         </w:rPr>
-        <w:t xml:space="preserve">4.6 16N1S Level-A 代表应用结果</w:t>
+        <w:t xml:space="preserve">4.6 代表应用：历史 optimized 与新 spill-noopt 扩展分区</w:t>
       </w:r>
     </w:p>
     <w:p>
@@ -12488,7 +11877,18 @@
         <w:rPr>
           <w:rFonts w:ascii="Calibri" w:hAnsi="Calibri" w:eastAsia="Microsoft YaHei" w:cs="Calibri"/>
         </w:rPr>
-        <w:t xml:space="preserve">可直接比较的 naive 与 optimized 端到端值；spill-noopt 正确性通过，同口径性能主值缺失记为⁠ ⁠N⁠/⁠A⁠。</w:t>
+        <w:t xml:space="preserve">可直接比较的历史 naive 与 optimized 端到端值；历史 spill-noopt 同口径性能主值缺失记为⁠ ⁠N⁠/⁠A⁠。</w:t>
+      </w:r>
+    </w:p>
+    <w:p>
+      <w:pPr>
+        <w:ind w:left="0" w:firstLine="420"/>
+      </w:pPr>
+      <w:r>
+        <w:rPr>
+          <w:rFonts w:ascii="Calibri" w:hAnsi="Calibri" w:eastAsia="Microsoft YaHei" w:cs="Calibri"/>
+        </w:rPr>
+        <w:t xml:space="preserve">此历史表不作为下方新图 4-3 ⁠的⁠数⁠值⁠源⁠。</w:t>
       </w:r>
     </w:p>
     <w:tbl>
@@ -13466,15 +12866,311 @@
     </w:p>
     <w:p>
       <w:pPr>
+        <w:pStyle w:val="FigureCaption"/>
+        <w:jc w:val="center"/>
+      </w:pPr>
+      <w:r>
+        <w:rPr>
+          <w:rFonts w:ascii="Calibri" w:hAnsi="Calibri" w:eastAsia="Microsoft YaHei" w:cs="Calibri"/>
+        </w:rPr>
+        <w:t xml:space="preserve">图 4-3 改用 2026-09-06–08 新批次全部 60 个 TC×拓扑×压力坐标的 naive 与 spill-noopt</w:t>
+      </w:r>
+    </w:p>
+    <w:p>
+      <w:pPr>
+        <w:ind w:left="0" w:firstLine="420"/>
+      </w:pPr>
+      <w:r>
+        <w:rPr>
+          <w:rFonts w:ascii="Calibri" w:hAnsi="Calibri" w:eastAsia="Microsoft YaHei" w:cs="Calibri"/>
+        </w:rPr>
+        <w:t xml:space="preserve">E2E 配对，共 120 个选定臂。应用臂不是 optimized，不与上方历⁠史⁠表⁠混⁠合⁠。</w:t>
+      </w:r>
+    </w:p>
+    <w:p>
+      <w:pPr>
+        <w:ind w:left="0" w:firstLine="420"/>
+      </w:pPr>
+      <w:r>
+        <w:rPr>
+          <w:rFonts w:ascii="Calibri" w:hAnsi="Calibri" w:eastAsia="Microsoft YaHei" w:cs="Calibri"/>
+        </w:rPr>
+        <w:t xml:space="preserve">沿用 summarize_database_perf_matrix.py 的 mean_plane_ns_per_operation：每 pl⁠a⁠n⁠e⁠ ⁠的</w:t>
+      </w:r>
+    </w:p>
+    <w:p>
+      <w:pPr>
+        <w:ind w:left="0" w:firstLine="420"/>
+      </w:pPr>
+      <w:r>
+        <w:rPr>
+          <w:rFonts w:ascii="Calibri" w:hAnsi="Calibri" w:eastAsia="Microsoft YaHei" w:cs="Calibri"/>
+        </w:rPr>
+        <w:t xml:space="preserve">counter_ticks × 10⁹ / frequency / operations 后跨 plane 等权平均；保留每 plan⁠e⁠ ⁠的⁠原⁠始</w:t>
+      </w:r>
+    </w:p>
+    <w:p>
+      <w:pPr>
+        <w:ind w:left="0" w:firstLine="420"/>
+      </w:pPr>
+      <w:r>
+        <w:rPr>
+          <w:rFonts w:ascii="Calibri" w:hAnsi="Calibri" w:eastAsia="Microsoft YaHei" w:cs="Calibri"/>
+        </w:rPr>
+        <w:t xml:space="preserve">operations 与频率。TC142–147 分别采用 db_oltp、db_btree、db_wal、faas、graph、feature</w:t>
+      </w:r>
+    </w:p>
+    <w:p>
+      <w:pPr>
+        <w:ind w:left="0" w:firstLine="420"/>
+      </w:pPr>
+      <w:r>
+        <w:rPr>
+          <w:rFonts w:ascii="Calibri" w:hAnsi="Calibri" w:eastAsia="Microsoft YaHei" w:cs="Calibri"/>
+        </w:rPr>
+        <w:t xml:space="preserve">的 end_to_end phase，不用 service 或 Outer 顶替。全部预期 plane 必须齐全⁠且⁠不⁠重⁠复⁠。</w:t>
+      </w:r>
+    </w:p>
+    <w:tbl>
+      <w:tblPr>
+        <w:tblStyle w:val="TableGrid"/>
+        <w:tblW w:w="5000" w:type="pct"/>
+        <w:tblLayout w:type="fixed"/>
+        <w:tblCellMar>
+          <w:top w:w="60" w:type="dxa"/>
+          <w:left w:w="90" w:type="dxa"/>
+          <w:bottom w:w="60" w:type="dxa"/>
+          <w:right w:w="90" w:type="dxa"/>
+        </w:tblCellMar>
+      </w:tblPr>
+      <w:tblGrid>
+        <w:gridCol w:w="2023"/>
+        <w:gridCol w:w="2023"/>
+        <w:gridCol w:w="5553"/>
+      </w:tblGrid>
+      <w:tr>
+        <w:trPr>
+          <w:cantSplit/>
+          <w:tblHeader/>
+        </w:trPr>
+        <w:tc>
+          <w:tcPr>
+            <w:tcW w:w="2023" w:type="dxa"/>
+            <w:shd w:val="clear" w:color="auto" w:fill="D9E2F3"/>
+          </w:tcPr>
+          <w:p>
+            <w:pPr>
+              <w:pStyle w:val="TableText"/>
+              <w:jc w:val="left"/>
+              <w:wordWrap w:val="0"/>
+              <w:spacing w:before="0" w:after="0" w:line="320" w:lineRule="exact"/>
+            </w:pPr>
+            <w:r>
+              <w:rPr>
+                <w:rFonts w:ascii="Calibri" w:hAnsi="Calibri" w:eastAsia="SimHei" w:cs="Calibri"/>
+                <w:b/>
+                <w:sz w:val="18"/>
+                <w:szCs w:val="18"/>
+              </w:rPr>
+              <w:t xml:space="preserve">新应用目录压力</w:t>
+            </w:r>
+          </w:p>
+        </w:tc>
+        <w:tc>
+          <w:tcPr>
+            <w:tcW w:w="2023" w:type="dxa"/>
+            <w:shd w:val="clear" w:color="auto" w:fill="D9E2F3"/>
+          </w:tcPr>
+          <w:p>
+            <w:pPr>
+              <w:pStyle w:val="TableText"/>
+              <w:jc w:val="left"/>
+              <w:wordWrap w:val="0"/>
+              <w:spacing w:before="0" w:after="0" w:line="320" w:lineRule="exact"/>
+            </w:pPr>
+            <w:r>
+              <w:rPr>
+                <w:rFonts w:ascii="Calibri" w:hAnsi="Calibri" w:eastAsia="SimHei" w:cs="Calibri"/>
+                <w:b/>
+                <w:sz w:val="18"/>
+                <w:szCs w:val="18"/>
+              </w:rPr>
+              <w:t xml:space="preserve">实测配对坐标</w:t>
+            </w:r>
+          </w:p>
+        </w:tc>
+        <w:tc>
+          <w:tcPr>
+            <w:tcW w:w="5553" w:type="dxa"/>
+            <w:shd w:val="clear" w:color="auto" w:fill="D9E2F3"/>
+          </w:tcPr>
+          <w:p>
+            <w:pPr>
+              <w:pStyle w:val="TableText"/>
+              <w:jc w:val="left"/>
+              <w:wordWrap w:val="0"/>
+              <w:spacing w:before="0" w:after="0" w:line="320" w:lineRule="exact"/>
+            </w:pPr>
+            <w:r>
+              <w:rPr>
+                <w:rFonts w:ascii="Calibri" w:hAnsi="Calibri" w:eastAsia="SimHei" w:cs="Calibri"/>
+                <w:b/>
+                <w:sz w:val="18"/>
+                <w:szCs w:val="18"/>
+              </w:rPr>
+              <w:t xml:space="preserve">n⁠a⁠i⁠v⁠e / s⁠p⁠i⁠l⁠l⁠-⁠n⁠o⁠o⁠p⁠t 层级 G⁠M</w:t>
+            </w:r>
+          </w:p>
+        </w:tc>
+      </w:tr>
+      <w:tr>
+        <w:trPr>
+          <w:cantSplit/>
+        </w:trPr>
+        <w:tc>
+          <w:tcPr>
+            <w:tcW w:w="2023" w:type="dxa"/>
+          </w:tcPr>
+          <w:p>
+            <w:pPr>
+              <w:pStyle w:val="TableText"/>
+              <w:jc w:val="left"/>
+              <w:wordWrap w:val="0"/>
+              <w:spacing w:before="0" w:after="0" w:line="320" w:lineRule="exact"/>
+            </w:pPr>
+            <w:r>
+              <w:rPr>
+                <w:rFonts w:ascii="Calibri" w:hAnsi="Calibri" w:eastAsia="Microsoft YaHei" w:cs="Calibri"/>
+                <w:sz w:val="18"/>
+                <w:szCs w:val="18"/>
+              </w:rPr>
+              <w:t xml:space="preserve">P⁠1⁠7⁠5</w:t>
+            </w:r>
+          </w:p>
+        </w:tc>
+        <w:tc>
+          <w:tcPr>
+            <w:tcW w:w="2023" w:type="dxa"/>
+          </w:tcPr>
+          <w:p>
+            <w:pPr>
+              <w:pStyle w:val="TableText"/>
+              <w:jc w:val="left"/>
+              <w:wordWrap w:val="0"/>
+              <w:spacing w:before="0" w:after="0" w:line="320" w:lineRule="exact"/>
+            </w:pPr>
+            <w:r>
+              <w:rPr>
+                <w:rFonts w:ascii="Calibri" w:hAnsi="Calibri" w:eastAsia="Microsoft YaHei" w:cs="Calibri"/>
+                <w:sz w:val="18"/>
+                <w:szCs w:val="18"/>
+              </w:rPr>
+              <w:t xml:space="preserve">30 / 30</w:t>
+            </w:r>
+          </w:p>
+        </w:tc>
+        <w:tc>
+          <w:tcPr>
+            <w:tcW w:w="5553" w:type="dxa"/>
+          </w:tcPr>
+          <w:p>
+            <w:pPr>
+              <w:pStyle w:val="TableText"/>
+              <w:jc w:val="left"/>
+              <w:wordWrap w:val="0"/>
+              <w:spacing w:before="0" w:after="0" w:line="320" w:lineRule="exact"/>
+            </w:pPr>
+            <w:r>
+              <w:rPr>
+                <w:rFonts w:ascii="Calibri" w:hAnsi="Calibri" w:eastAsia="Microsoft YaHei" w:cs="Calibri"/>
+                <w:sz w:val="18"/>
+                <w:szCs w:val="18"/>
+              </w:rPr>
+              <w:t xml:space="preserve">1.107×</w:t>
+            </w:r>
+          </w:p>
+        </w:tc>
+      </w:tr>
+      <w:tr>
+        <w:trPr>
+          <w:cantSplit/>
+        </w:trPr>
+        <w:tc>
+          <w:tcPr>
+            <w:tcW w:w="2023" w:type="dxa"/>
+          </w:tcPr>
+          <w:p>
+            <w:pPr>
+              <w:pStyle w:val="TableText"/>
+              <w:jc w:val="left"/>
+              <w:wordWrap w:val="0"/>
+              <w:spacing w:before="0" w:after="0" w:line="320" w:lineRule="exact"/>
+            </w:pPr>
+            <w:r>
+              <w:rPr>
+                <w:rFonts w:ascii="Calibri" w:hAnsi="Calibri" w:eastAsia="Microsoft YaHei" w:cs="Calibri"/>
+                <w:sz w:val="18"/>
+                <w:szCs w:val="18"/>
+              </w:rPr>
+              <w:t xml:space="preserve">P⁠2⁠0⁠0</w:t>
+            </w:r>
+          </w:p>
+        </w:tc>
+        <w:tc>
+          <w:tcPr>
+            <w:tcW w:w="2023" w:type="dxa"/>
+          </w:tcPr>
+          <w:p>
+            <w:pPr>
+              <w:pStyle w:val="TableText"/>
+              <w:jc w:val="left"/>
+              <w:wordWrap w:val="0"/>
+              <w:spacing w:before="0" w:after="0" w:line="320" w:lineRule="exact"/>
+            </w:pPr>
+            <w:r>
+              <w:rPr>
+                <w:rFonts w:ascii="Calibri" w:hAnsi="Calibri" w:eastAsia="Microsoft YaHei" w:cs="Calibri"/>
+                <w:sz w:val="18"/>
+                <w:szCs w:val="18"/>
+              </w:rPr>
+              <w:t xml:space="preserve">30 / 30</w:t>
+            </w:r>
+          </w:p>
+        </w:tc>
+        <w:tc>
+          <w:tcPr>
+            <w:tcW w:w="5553" w:type="dxa"/>
+          </w:tcPr>
+          <w:p>
+            <w:pPr>
+              <w:pStyle w:val="TableText"/>
+              <w:jc w:val="left"/>
+              <w:wordWrap w:val="0"/>
+              <w:spacing w:before="0" w:after="0" w:line="320" w:lineRule="exact"/>
+            </w:pPr>
+            <w:r>
+              <w:rPr>
+                <w:rFonts w:ascii="Calibri" w:hAnsi="Calibri" w:eastAsia="Microsoft YaHei" w:cs="Calibri"/>
+                <w:sz w:val="18"/>
+                <w:szCs w:val="18"/>
+              </w:rPr>
+              <w:t xml:space="preserve">1.109×</w:t>
+            </w:r>
+          </w:p>
+        </w:tc>
+      </w:tr>
+    </w:tbl>
+    <w:p>
+      <w:pPr>
         <w:jc w:val="center"/>
         <w:spacing w:before="100" w:after="40" w:line="240" w:lineRule="auto"/>
       </w:pPr>
       <w:r>
         <w:drawing>
           <wp:inline distT="0" distB="0" distL="0" distR="0">
-            <wp:extent cx="3959999" cy="1805624"/>
+            <wp:extent cx="5580000" cy="2414931"/>
             <wp:effectExtent l="0" t="0" r="0" b="0"/>
-            <wp:docPr id="6" name="图 4-3 TC142-TC147 代表应用降幅" descr="图 4-3 TC142-TC147 代表应用降幅"/>
+            <wp:docPr id="6" name="图 4-3 TC142-TC147 新应用 E2E speedup" descr="图 4-3 TC142-TC147 新应用 E2E speedup"/>
             <wp:cNvGraphicFramePr>
               <a:graphicFrameLocks xmlns:a="http://schemas.openxmlformats.org/drawingml/2006/main" noChangeAspect="1"/>
             </wp:cNvGraphicFramePr>
@@ -13482,7 +13178,7 @@
               <a:graphicData uri="http://schemas.openxmlformats.org/drawingml/2006/picture">
                 <pic:pic xmlns:pic="http://schemas.openxmlformats.org/drawingml/2006/picture">
                   <pic:nvPicPr>
-                    <pic:cNvPr id="6" name="图 4-3 TC142-TC147 代表应用降幅"/>
+                    <pic:cNvPr id="6" name="图 4-3 TC142-TC147 新应用 E2E speedup"/>
                     <pic:cNvPicPr/>
                   </pic:nvPicPr>
                   <pic:blipFill>
@@ -13494,7 +13190,7 @@
                   <pic:spPr>
                     <a:xfrm>
                       <a:off x="0" y="0"/>
-                      <a:ext cx="3959999" cy="1805624"/>
+                      <a:ext cx="5580000" cy="2414931"/>
                     </a:xfrm>
                     <a:prstGeom prst="rect">
                       <a:avLst/>
@@ -13516,7 +13212,18 @@
         <w:rPr>
           <w:rFonts w:ascii="Calibri" w:hAnsi="Calibri" w:eastAsia="Microsoft YaHei" w:cs="Calibri"/>
         </w:rPr>
-        <w:t xml:space="preserve">图 4-3　TC142-TC147 代表应用降幅</w:t>
+        <w:t xml:space="preserve">图 4-3　新应用 naive / spill-noopt E2E speedup；每 TC 内跨拓扑 GM，再跨 TC GM；</w:t>
+      </w:r>
+    </w:p>
+    <w:p>
+      <w:pPr>
+        <w:ind w:left="0" w:firstLine="420"/>
+      </w:pPr>
+      <w:r>
+        <w:rPr>
+          <w:rFonts w:ascii="Calibri" w:hAnsi="Calibri" w:eastAsia="Microsoft YaHei" w:cs="Calibri"/>
+        </w:rPr>
+        <w:t xml:space="preserve">P175/P200 分面独立汇总，参考线 1×、1/0.9×。不把该 GM 当作原场景 10% 正式⁠通⁠过⁠判⁠据⁠。</w:t>
       </w:r>
     </w:p>
     <w:p>
@@ -13529,6 +13236,72 @@
           <w:rFonts w:ascii="Calibri" w:hAnsi="Calibri" w:eastAsia="SimHei" w:cs="Calibri"/>
         </w:rPr>
         <w:t xml:space="preserve">5. 指标 3：UBCC 与 HA-VI 配对比较</w:t>
+      </w:r>
+    </w:p>
+    <w:p>
+      <w:pPr>
+        <w:ind w:left="0" w:firstLine="420"/>
+      </w:pPr>
+      <w:r>
+        <w:rPr>
+          <w:rFonts w:ascii="Calibri" w:hAnsi="Calibri" w:eastAsia="Microsoft YaHei" w:cs="Calibri"/>
+        </w:rPr>
+        <w:t xml:space="preserve">本章表与图 5-1、5-2 仍为历史 2N1S/P100 正式参考模型结果，不是 9 月 8 日多拓⁠扑⁠新⁠实⁠测⁠。</w:t>
+      </w:r>
+    </w:p>
+    <w:p>
+      <w:pPr>
+        <w:ind w:left="0" w:firstLine="420"/>
+      </w:pPr>
+      <w:r>
+        <w:rPr>
+          <w:rFonts w:ascii="Calibri" w:hAnsi="Calibri" w:eastAsia="Microsoft YaHei" w:cs="Calibri"/>
+        </w:rPr>
+        <w:t xml:space="preserve">2026-09-08 多拓扑 P100 批次计划 480 臂（8 TC×6 拓扑×5 pairs×2），先做 96 臂 gate。</w:t>
+      </w:r>
+    </w:p>
+    <w:p>
+      <w:pPr>
+        <w:ind w:left="0" w:firstLine="420"/>
+      </w:pPr>
+      <w:r>
+        <w:rPr>
+          <w:rFonts w:ascii="Calibri" w:hAnsi="Calibri" w:eastAsia="Microsoft YaHei" w:cs="Calibri"/>
+        </w:rPr>
+        <w:t xml:space="preserve">本次只读检查时 state/progress.json 为 BLOCKED，首轮 2N1S/TC228 的 HA-VI 臂 runner</w:t>
+      </w:r>
+    </w:p>
+    <w:p>
+      <w:pPr>
+        <w:ind w:left="0" w:firstLine="420"/>
+      </w:pPr>
+      <w:r>
+        <w:rPr>
+          <w:rFonts w:ascii="Calibri" w:hAnsi="Calibri" w:eastAsia="Microsoft YaHei" w:cs="Calibri"/>
+        </w:rPr>
+        <w:t xml:space="preserve">return code 1，exit.json 为 1；未形成完整 gate，不发布新 P100 总体 GM，缺失⁠不⁠画⁠零⁠柱⁠。</w:t>
+      </w:r>
+    </w:p>
+    <w:p>
+      <w:pPr>
+        <w:ind w:left="0" w:firstLine="420"/>
+      </w:pPr>
+      <w:r>
+        <w:rPr>
+          <w:rFonts w:ascii="Calibri" w:hAnsi="Calibri" w:eastAsia="Microsoft YaHei" w:cs="Calibri"/>
+        </w:rPr>
+        <w:t xml:space="preserve">9 月 7 日 metric23-single 的 M3 为 2N1S/P0 单对，不混入 P100。新补测⁠尚⁠不⁠能⁠支⁠持</w:t>
+      </w:r>
+    </w:p>
+    <w:p>
+      <w:pPr>
+        <w:ind w:left="0" w:firstLine="420"/>
+      </w:pPr>
+      <w:r>
+        <w:rPr>
+          <w:rFonts w:ascii="Calibri" w:hAnsi="Calibri" w:eastAsia="Microsoft YaHei" w:cs="Calibri"/>
+        </w:rPr>
+        <w:t xml:space="preserve">TC×多拓扑比较，因此保留有覆盖的历史图，所有历史数值仅在原配置范⁠围⁠内⁠解⁠释⁠。</w:t>
       </w:r>
     </w:p>
     <w:p>
@@ -16307,7 +16080,7 @@
       <w:r>
         <w:drawing>
           <wp:inline distT="0" distB="0" distL="0" distR="0">
-            <wp:extent cx="3960000" cy="1809025"/>
+            <wp:extent cx="3960000" cy="1892122"/>
             <wp:effectExtent l="0" t="0" r="0" b="0"/>
             <wp:docPr id="7" name="图 5-1 指标 3 UBCC 与 HA-VI 配对比较" descr="图 5-1 指标 3 UBCC 与 HA-VI 配对比较"/>
             <wp:cNvGraphicFramePr>
@@ -16329,7 +16102,7 @@
                   <pic:spPr>
                     <a:xfrm>
                       <a:off x="0" y="0"/>
-                      <a:ext cx="3960000" cy="1809025"/>
+                      <a:ext cx="3960000" cy="1892122"/>
                     </a:xfrm>
                     <a:prstGeom prst="rect">
                       <a:avLst/>
@@ -16351,7 +16124,7 @@
         <w:rPr>
           <w:rFonts w:ascii="Calibri" w:hAnsi="Calibri" w:eastAsia="Microsoft YaHei" w:cs="Calibri"/>
         </w:rPr>
-        <w:t xml:space="preserve">图 5-1　指标 3 配对结果</w:t>
+        <w:t xml:space="preserve">图 5-1　历史 2N1S/P100 的 HA-VI / UBCC 组均值比，参考线 1×；沿用原正式组权重，非层级 GM。</w:t>
       </w:r>
     </w:p>
     <w:p>
@@ -17439,7 +17212,7 @@
       <w:r>
         <w:drawing>
           <wp:inline distT="0" distB="0" distL="0" distR="0">
-            <wp:extent cx="3960000" cy="2463723"/>
+            <wp:extent cx="3960000" cy="2366200"/>
             <wp:effectExtent l="0" t="0" r="0" b="0"/>
             <wp:docPr id="8" name="图 5-2 指标 3 每 testcase 降幅" descr="图 5-2 指标 3 每 testcase 降幅"/>
             <wp:cNvGraphicFramePr>
@@ -17461,7 +17234,7 @@
                   <pic:spPr>
                     <a:xfrm>
                       <a:off x="0" y="0"/>
-                      <a:ext cx="3960000" cy="2463723"/>
+                      <a:ext cx="3960000" cy="2366200"/>
                     </a:xfrm>
                     <a:prstGeom prst="rect">
                       <a:avLst/>
@@ -17483,7 +17256,18 @@
         <w:rPr>
           <w:rFonts w:ascii="Calibri" w:hAnsi="Calibri" w:eastAsia="Microsoft YaHei" w:cs="Calibri"/>
         </w:rPr>
-        <w:t xml:space="preserve">图 5-2　指标 3 每 testcase 降幅</w:t>
+        <w:t xml:space="preserve">图 5-2　历史 2N1S/P100 每 testcase 的 HA-VI / UBCC speedup 与八 TC 等权 GM，参考线 1×。</w:t>
+      </w:r>
+    </w:p>
+    <w:p>
+      <w:pPr>
+        <w:ind w:left="0" w:firstLine="420"/>
+      </w:pPr>
+      <w:r>
+        <w:rPr>
+          <w:rFonts w:ascii="Calibri" w:hAnsi="Calibri" w:eastAsia="Microsoft YaHei" w:cs="Calibri"/>
+        </w:rPr>
+        <w:t xml:space="preserve">只有一个拓扑，组内拓扑 GM 等于该单值；此展示 GM 不替代上表历史正式组 A⁠M⁠ ⁠判⁠据⁠。</w:t>
       </w:r>
     </w:p>
     <w:p>

</xml_diff>